<commit_message>
docs: rewrite from-scratch install guide (1405.5.23ν)
The 1KB JSON in updates/ is not the program. The operator guide now
starts from a blank PC: copy the folder, open Sirman_Final.html or
build Sirman.exe, and only then covers update of an existing install.

Co-authored-by: estelami1366-ux <estelami1366-ux@users.noreply.github.com>
</commit_message>
<xml_diff>
--- a/desktop/Sirman_Install_Kit/راهنمای_نصب_و_آپدیت.docx
+++ b/desktop/Sirman_Install_Kit/راهنمای_نصب_و_آپدیت.docx
@@ -5,686 +5,1341 @@
     <w:p>
       <w:pPr>
         <w:pStyle w:val="Heading1"/>
+        <w:bidi w:val="1"/>
         <w:jc w:val="right"/>
       </w:pPr>
       <w:r>
-        <w:t>راهنمای نصب و آپدیت سیرمان</w:t>
+        <w:rPr>
+          <w:rFonts w:ascii="Tahoma" w:hAnsi="Tahoma" w:cs="Tahoma" w:eastAsia="Tahoma"/>
+          <w:b/>
+          <w:sz w:val="24"/>
+          <w:rtl w:val="1"/>
+          <w:cs/>
+        </w:rPr>
+        <w:t>راهنمای نصب سیرمان از صفر</w:t>
       </w:r>
     </w:p>
     <w:p>
       <w:pPr>
+        <w:bidi w:val="1"/>
         <w:jc w:val="right"/>
       </w:pPr>
       <w:r>
         <w:rPr>
+          <w:rFonts w:ascii="Tahoma" w:hAnsi="Tahoma" w:cs="Tahoma" w:eastAsia="Tahoma"/>
           <w:b w:val="0"/>
           <w:sz w:val="24"/>
+          <w:rtl w:val="1"/>
+          <w:cs/>
         </w:rPr>
         <w:t>لایق الکترونیک پارسیان</w:t>
       </w:r>
     </w:p>
     <w:p>
       <w:pPr>
+        <w:bidi w:val="1"/>
         <w:jc w:val="right"/>
       </w:pPr>
       <w:r>
         <w:rPr>
-          <w:b w:val="0"/>
+          <w:rFonts w:ascii="Tahoma" w:hAnsi="Tahoma" w:cs="Tahoma" w:eastAsia="Tahoma"/>
+          <w:b/>
           <w:sz w:val="24"/>
+          <w:rtl w:val="1"/>
+          <w:cs/>
         </w:rPr>
-        <w:t>نسخه جاری نرم‌افزار: ۱۴۰۵.۵.۲۳μ</w:t>
+        <w:t>نسخه جاری نرم‌افزار: ۱۴۰۵.۵.۲۳ν</w:t>
       </w:r>
     </w:p>
     <w:p>
       <w:pPr>
+        <w:bidi w:val="1"/>
         <w:jc w:val="right"/>
       </w:pPr>
       <w:r>
         <w:rPr>
+          <w:rFonts w:ascii="Tahoma" w:hAnsi="Tahoma" w:cs="Tahoma" w:eastAsia="Tahoma"/>
           <w:b w:val="0"/>
           <w:sz w:val="24"/>
+          <w:rtl w:val="1"/>
+          <w:cs/>
         </w:rPr>
         <w:t>تاریخ: ۱۴۰۵/۰۵/۲۳</w:t>
       </w:r>
     </w:p>
     <w:p>
       <w:pPr>
-        <w:pStyle w:val="Heading2"/>
-        <w:jc w:val="right"/>
-      </w:pPr>
-      <w:r>
-        <w:t>۱. آیا روش نصب عوض شده؟</w:t>
-      </w:r>
-    </w:p>
-    <w:p>
-      <w:pPr>
+        <w:bidi w:val="1"/>
         <w:jc w:val="right"/>
       </w:pPr>
       <w:r>
         <w:rPr>
+          <w:rFonts w:ascii="Tahoma" w:hAnsi="Tahoma" w:cs="Tahoma" w:eastAsia="Tahoma"/>
           <w:b w:val="0"/>
           <w:sz w:val="24"/>
+          <w:rtl w:val="1"/>
+          <w:cs/>
         </w:rPr>
-        <w:t>خیر. مراحل نصب و آپدیت مثل قبل است.</w:t>
-      </w:r>
-    </w:p>
-    <w:p>
-      <w:pPr>
-        <w:jc w:val="right"/>
-      </w:pPr>
-      <w:r>
-        <w:rPr>
-          <w:b w:val="0"/>
-          <w:sz w:val="24"/>
-        </w:rPr>
-        <w:t>همان لانچر، همان تب آپدیت، همان میانبر دسکتاپ.</w:t>
-      </w:r>
-    </w:p>
-    <w:p>
-      <w:pPr>
-        <w:jc w:val="right"/>
-      </w:pPr>
-      <w:r>
-        <w:rPr>
-          <w:b w:val="0"/>
-          <w:sz w:val="24"/>
-        </w:rPr>
-        <w:t>فقط فایل این نسخه را جایگزین کنید. داده قبلی پاک نمی‌شود.</w:t>
+        <w:t>این راهنما برای کسی نوشته شده که تا حالا این برنامه را روی این کامپیوتر نداشته. از اول تا آخر پیش بروید.</w:t>
       </w:r>
     </w:p>
     <w:p>
       <w:pPr>
         <w:pStyle w:val="Heading2"/>
+        <w:bidi w:val="1"/>
         <w:jc w:val="right"/>
       </w:pPr>
       <w:r>
-        <w:t>۲. نصب اول (کامپیوتر جدید)</w:t>
+        <w:rPr>
+          <w:rFonts w:ascii="Tahoma" w:hAnsi="Tahoma" w:cs="Tahoma" w:eastAsia="Tahoma"/>
+          <w:b/>
+          <w:sz w:val="24"/>
+          <w:rtl w:val="1"/>
+          <w:cs/>
+        </w:rPr>
+        <w:t>۱) اول این را بخوانید — فایل یک‌کیلوبایتی برنامه نیست</w:t>
       </w:r>
     </w:p>
     <w:p>
       <w:pPr>
+        <w:bidi w:val="1"/>
         <w:jc w:val="right"/>
       </w:pPr>
       <w:r>
         <w:rPr>
+          <w:rFonts w:ascii="Tahoma" w:hAnsi="Tahoma" w:cs="Tahoma" w:eastAsia="Tahoma"/>
+          <w:b/>
+          <w:color w:val="B45309"/>
+          <w:sz w:val="24"/>
+          <w:rtl w:val="1"/>
+          <w:cs/>
+        </w:rPr>
+        <w:t>اگر فایلی دیدید شبیه Sirman_Update_….json که حجمش حدود ۱ کیلوبایت است، آن فایل برنامه نیست.</w:t>
+      </w:r>
+    </w:p>
+    <w:p>
+      <w:pPr>
+        <w:bidi w:val="1"/>
+        <w:jc w:val="right"/>
+      </w:pPr>
+      <w:r>
+        <w:rPr>
+          <w:rFonts w:ascii="Tahoma" w:hAnsi="Tahoma" w:cs="Tahoma" w:eastAsia="Tahoma"/>
+          <w:b w:val="0"/>
+          <w:sz w:val="24"/>
+          <w:rtl w:val="1"/>
+          <w:cs/>
+        </w:rPr>
+        <w:t>با باز کردن یا بارگذاری آن فایل، نرم‌افزار نصب نمی‌شود. آن فایل حداکثر شماره نسخه را عوض می‌کند.</w:t>
+      </w:r>
+    </w:p>
+    <w:p>
+      <w:pPr>
+        <w:bidi w:val="1"/>
+        <w:jc w:val="right"/>
+      </w:pPr>
+      <w:r>
+        <w:rPr>
+          <w:rFonts w:ascii="Tahoma" w:hAnsi="Tahoma" w:cs="Tahoma" w:eastAsia="Tahoma"/>
           <w:b/>
           <w:sz w:val="24"/>
+          <w:rtl w:val="1"/>
+          <w:cs/>
         </w:rPr>
-        <w:t>پوشه برنامه را روی کامپیوتر کپی کنید. بعد یکی از این سه راه:</w:t>
+        <w:t>برنامه واقعی این‌هاست:</w:t>
+      </w:r>
+    </w:p>
+    <w:p>
+      <w:pPr>
+        <w:pStyle w:val="ListBullet"/>
+        <w:bidi w:val="1"/>
+        <w:jc w:val="right"/>
+      </w:pPr>
+      <w:r>
+        <w:rPr>
+          <w:rFonts w:ascii="Tahoma" w:hAnsi="Tahoma" w:cs="Tahoma" w:eastAsia="Tahoma"/>
+          <w:sz w:val="24"/>
+          <w:rtl w:val="1"/>
+          <w:cs/>
+        </w:rPr>
+        <w:t>Sirman_Final.html — خود نرم‌افزار. حجم حدود ۱٫۶ مگابایت. اگر چند کیلوبایت بود، فایل اشتباه است.</w:t>
+      </w:r>
+    </w:p>
+    <w:p>
+      <w:pPr>
+        <w:pStyle w:val="ListBullet"/>
+        <w:bidi w:val="1"/>
+        <w:jc w:val="right"/>
+      </w:pPr>
+      <w:r>
+        <w:rPr>
+          <w:rFonts w:ascii="Tahoma" w:hAnsi="Tahoma" w:cs="Tahoma" w:eastAsia="Tahoma"/>
+          <w:sz w:val="24"/>
+          <w:rtl w:val="1"/>
+          <w:cs/>
+        </w:rPr>
+        <w:t>Sirman.exe — پنجره ویندوز (اختیاری). معمولاً آماده در گیت‌هاب نیست؛ باید با build-win.bat ساخته شود.</w:t>
+      </w:r>
+    </w:p>
+    <w:p>
+      <w:pPr>
+        <w:bidi w:val="1"/>
+        <w:jc w:val="right"/>
+      </w:pPr>
+      <w:r>
+        <w:rPr>
+          <w:rFonts w:ascii="Tahoma" w:hAnsi="Tahoma" w:cs="Tahoma" w:eastAsia="Tahoma"/>
+          <w:b/>
+          <w:sz w:val="24"/>
+          <w:rtl w:val="1"/>
+          <w:cs/>
+        </w:rPr>
+        <w:t>اگر فقط JSON یک‌کیلوبایتی را کپی کردید، هیچ برنامه‌ای آپدیت نشده است.</w:t>
+      </w:r>
+    </w:p>
+    <w:p>
+      <w:pPr>
+        <w:pStyle w:val="Heading2"/>
+        <w:bidi w:val="1"/>
+        <w:jc w:val="right"/>
+      </w:pPr>
+      <w:r>
+        <w:rPr>
+          <w:rFonts w:ascii="Tahoma" w:hAnsi="Tahoma" w:cs="Tahoma" w:eastAsia="Tahoma"/>
+          <w:b/>
+          <w:sz w:val="24"/>
+          <w:rtl w:val="1"/>
+          <w:cs/>
+        </w:rPr>
+        <w:t>۲) چه چیزی باید داشته باشید</w:t>
+      </w:r>
+    </w:p>
+    <w:p>
+      <w:pPr>
+        <w:bidi w:val="1"/>
+        <w:jc w:val="right"/>
+      </w:pPr>
+      <w:r>
+        <w:rPr>
+          <w:rFonts w:ascii="Tahoma" w:hAnsi="Tahoma" w:cs="Tahoma" w:eastAsia="Tahoma"/>
+          <w:b w:val="0"/>
+          <w:sz w:val="24"/>
+          <w:rtl w:val="1"/>
+          <w:cs/>
+        </w:rPr>
+        <w:t>کل پوشه برنامه را بگیرید، نه یک فایل تکی.</w:t>
+      </w:r>
+    </w:p>
+    <w:p>
+      <w:pPr>
+        <w:bidi w:val="1"/>
+        <w:jc w:val="right"/>
+      </w:pPr>
+      <w:r>
+        <w:rPr>
+          <w:rFonts w:ascii="Tahoma" w:hAnsi="Tahoma" w:cs="Tahoma" w:eastAsia="Tahoma"/>
+          <w:b/>
+          <w:sz w:val="24"/>
+          <w:rtl w:val="1"/>
+          <w:cs/>
+        </w:rPr>
+        <w:t>حداقل برای روش ساده:</w:t>
+      </w:r>
+    </w:p>
+    <w:p>
+      <w:pPr>
+        <w:pStyle w:val="ListBullet"/>
+        <w:bidi w:val="1"/>
+        <w:jc w:val="right"/>
+      </w:pPr>
+      <w:r>
+        <w:rPr>
+          <w:rFonts w:ascii="Tahoma" w:hAnsi="Tahoma" w:cs="Tahoma" w:eastAsia="Tahoma"/>
+          <w:sz w:val="24"/>
+          <w:rtl w:val="1"/>
+          <w:cs/>
+        </w:rPr>
+        <w:t>Sirman_Final.html  (حدود ۱٫۶ مگابایت)</w:t>
+      </w:r>
+    </w:p>
+    <w:p>
+      <w:pPr>
+        <w:pStyle w:val="ListBullet"/>
+        <w:bidi w:val="1"/>
+        <w:jc w:val="right"/>
+      </w:pPr>
+      <w:r>
+        <w:rPr>
+          <w:rFonts w:ascii="Tahoma" w:hAnsi="Tahoma" w:cs="Tahoma" w:eastAsia="Tahoma"/>
+          <w:sz w:val="24"/>
+          <w:rtl w:val="1"/>
+          <w:cs/>
+        </w:rPr>
+        <w:t>Sirman_Start.bat</w:t>
+      </w:r>
+    </w:p>
+    <w:p>
+      <w:pPr>
+        <w:pStyle w:val="ListBullet"/>
+        <w:bidi w:val="1"/>
+        <w:jc w:val="right"/>
+      </w:pPr>
+      <w:r>
+        <w:rPr>
+          <w:rFonts w:ascii="Tahoma" w:hAnsi="Tahoma" w:cs="Tahoma" w:eastAsia="Tahoma"/>
+          <w:sz w:val="24"/>
+          <w:rtl w:val="1"/>
+          <w:cs/>
+        </w:rPr>
+        <w:t>نصب_میانبر_سیرمان.bat  (برای آیکون دسکتاپ، اختیاری)</w:t>
+      </w:r>
+    </w:p>
+    <w:p>
+      <w:pPr>
+        <w:bidi w:val="1"/>
+        <w:jc w:val="right"/>
+      </w:pPr>
+      <w:r>
+        <w:rPr>
+          <w:rFonts w:ascii="Tahoma" w:hAnsi="Tahoma" w:cs="Tahoma" w:eastAsia="Tahoma"/>
+          <w:b/>
+          <w:sz w:val="24"/>
+          <w:rtl w:val="1"/>
+          <w:cs/>
+        </w:rPr>
+        <w:t>برای پنجره ویندوز علاوه بر آن:</w:t>
+      </w:r>
+    </w:p>
+    <w:p>
+      <w:pPr>
+        <w:pStyle w:val="ListBullet"/>
+        <w:bidi w:val="1"/>
+        <w:jc w:val="right"/>
+      </w:pPr>
+      <w:r>
+        <w:rPr>
+          <w:rFonts w:ascii="Tahoma" w:hAnsi="Tahoma" w:cs="Tahoma" w:eastAsia="Tahoma"/>
+          <w:sz w:val="24"/>
+          <w:rtl w:val="1"/>
+          <w:cs/>
+        </w:rPr>
+        <w:t>پوشه desktop\Sirman_Windows_Install یا desktop\Sirman_Install_Kit</w:t>
+      </w:r>
+    </w:p>
+    <w:p>
+      <w:pPr>
+        <w:pStyle w:val="ListBullet"/>
+        <w:bidi w:val="1"/>
+        <w:jc w:val="right"/>
+      </w:pPr>
+      <w:r>
+        <w:rPr>
+          <w:rFonts w:ascii="Tahoma" w:hAnsi="Tahoma" w:cs="Tahoma" w:eastAsia="Tahoma"/>
+          <w:sz w:val="24"/>
+          <w:rtl w:val="1"/>
+          <w:cs/>
+        </w:rPr>
+        <w:t>build-win.bat و نصب_سیرمان.bat</w:t>
+      </w:r>
+    </w:p>
+    <w:p>
+      <w:pPr>
+        <w:pStyle w:val="ListBullet"/>
+        <w:bidi w:val="1"/>
+        <w:jc w:val="right"/>
+      </w:pPr>
+      <w:r>
+        <w:rPr>
+          <w:rFonts w:ascii="Tahoma" w:hAnsi="Tahoma" w:cs="Tahoma" w:eastAsia="Tahoma"/>
+          <w:sz w:val="24"/>
+          <w:rtl w:val="1"/>
+          <w:cs/>
+        </w:rPr>
+        <w:t>پوشه Sirman.Desktop (سورس ساخت exe)</w:t>
+      </w:r>
+    </w:p>
+    <w:p>
+      <w:pPr>
+        <w:bidi w:val="1"/>
+        <w:jc w:val="right"/>
+      </w:pPr>
+      <w:r>
+        <w:rPr>
+          <w:rFonts w:ascii="Tahoma" w:hAnsi="Tahoma" w:cs="Tahoma" w:eastAsia="Tahoma"/>
+          <w:b w:val="0"/>
+          <w:sz w:val="24"/>
+          <w:rtl w:val="1"/>
+          <w:cs/>
+        </w:rPr>
+        <w:t>از گیت‌هاب کل مخزن را Download ZIP کنید. فقط فایل داخل پوشه updates را دانلود نکنید.</w:t>
+      </w:r>
+    </w:p>
+    <w:p>
+      <w:pPr>
+        <w:pStyle w:val="Heading2"/>
+        <w:bidi w:val="1"/>
+        <w:jc w:val="right"/>
+      </w:pPr>
+      <w:r>
+        <w:rPr>
+          <w:rFonts w:ascii="Tahoma" w:hAnsi="Tahoma" w:cs="Tahoma" w:eastAsia="Tahoma"/>
+          <w:b/>
+          <w:sz w:val="24"/>
+          <w:rtl w:val="1"/>
+          <w:cs/>
+        </w:rPr>
+        <w:t>۳) روش ۱ — ساده‌ترین نصب از صفر (شروع سریع)</w:t>
+      </w:r>
+    </w:p>
+    <w:p>
+      <w:pPr>
+        <w:bidi w:val="1"/>
+        <w:jc w:val="right"/>
+      </w:pPr>
+      <w:r>
+        <w:rPr>
+          <w:rFonts w:ascii="Tahoma" w:hAnsi="Tahoma" w:cs="Tahoma" w:eastAsia="Tahoma"/>
+          <w:b w:val="0"/>
+          <w:sz w:val="24"/>
+          <w:rtl w:val="1"/>
+          <w:cs/>
+        </w:rPr>
+        <w:t>این روش مرورگر را باز می‌کند و برای شروع کار فروشگاه کافی است.</w:t>
       </w:r>
     </w:p>
     <w:p>
       <w:pPr>
         <w:pStyle w:val="Heading3"/>
+        <w:bidi w:val="1"/>
         <w:jc w:val="right"/>
       </w:pPr>
       <w:r>
-        <w:t>راه ۱ — اگر Sirman.exe دارید (پیشنهاد)</w:t>
+        <w:rPr>
+          <w:rFonts w:ascii="Tahoma" w:hAnsi="Tahoma" w:cs="Tahoma" w:eastAsia="Tahoma"/>
+          <w:b/>
+          <w:sz w:val="24"/>
+          <w:rtl w:val="1"/>
+          <w:cs/>
+        </w:rPr>
+        <w:t>گام ۱</w:t>
+      </w:r>
+    </w:p>
+    <w:p>
+      <w:pPr>
+        <w:bidi w:val="1"/>
+        <w:jc w:val="right"/>
+      </w:pPr>
+      <w:r>
+        <w:rPr>
+          <w:rFonts w:ascii="Tahoma" w:hAnsi="Tahoma" w:cs="Tahoma" w:eastAsia="Tahoma"/>
+          <w:b w:val="0"/>
+          <w:sz w:val="24"/>
+          <w:rtl w:val="1"/>
+          <w:cs/>
+        </w:rPr>
+        <w:t>کل پوشه برنامه را روی کامپیوتر کپی کنید. مثال: Documents\Sirman یا D:\Sirman</w:t>
+      </w:r>
+    </w:p>
+    <w:p>
+      <w:pPr>
+        <w:pStyle w:val="Heading3"/>
+        <w:bidi w:val="1"/>
+        <w:jc w:val="right"/>
+      </w:pPr>
+      <w:r>
+        <w:rPr>
+          <w:rFonts w:ascii="Tahoma" w:hAnsi="Tahoma" w:cs="Tahoma" w:eastAsia="Tahoma"/>
+          <w:b/>
+          <w:sz w:val="24"/>
+          <w:rtl w:val="1"/>
+          <w:cs/>
+        </w:rPr>
+        <w:t>گام ۲</w:t>
+      </w:r>
+    </w:p>
+    <w:p>
+      <w:pPr>
+        <w:bidi w:val="1"/>
+        <w:jc w:val="right"/>
+      </w:pPr>
+      <w:r>
+        <w:rPr>
+          <w:rFonts w:ascii="Tahoma" w:hAnsi="Tahoma" w:cs="Tahoma" w:eastAsia="Tahoma"/>
+          <w:b w:val="0"/>
+          <w:sz w:val="24"/>
+          <w:rtl w:val="1"/>
+          <w:cs/>
+        </w:rPr>
+        <w:t>داخل پوشه روی Sirman_Final.html یا بهتر: Sirman_Start.bat دوبار کلیک کنید.</w:t>
+      </w:r>
+    </w:p>
+    <w:p>
+      <w:pPr>
+        <w:pStyle w:val="Heading3"/>
+        <w:bidi w:val="1"/>
+        <w:jc w:val="right"/>
+      </w:pPr>
+      <w:r>
+        <w:rPr>
+          <w:rFonts w:ascii="Tahoma" w:hAnsi="Tahoma" w:cs="Tahoma" w:eastAsia="Tahoma"/>
+          <w:b/>
+          <w:sz w:val="24"/>
+          <w:rtl w:val="1"/>
+          <w:cs/>
+        </w:rPr>
+        <w:t>گام ۳</w:t>
+      </w:r>
+    </w:p>
+    <w:p>
+      <w:pPr>
+        <w:bidi w:val="1"/>
+        <w:jc w:val="right"/>
+      </w:pPr>
+      <w:r>
+        <w:rPr>
+          <w:rFonts w:ascii="Tahoma" w:hAnsi="Tahoma" w:cs="Tahoma" w:eastAsia="Tahoma"/>
+          <w:b w:val="0"/>
+          <w:sz w:val="24"/>
+          <w:rtl w:val="1"/>
+          <w:cs/>
+        </w:rPr>
+        <w:t>برنامه باز می‌شود. اگر اولین بار است، رمز مدیر سیستم را بگذارید و به خاطر بسپارید.</w:t>
+      </w:r>
+    </w:p>
+    <w:p>
+      <w:pPr>
+        <w:pStyle w:val="Heading3"/>
+        <w:bidi w:val="1"/>
+        <w:jc w:val="right"/>
+      </w:pPr>
+      <w:r>
+        <w:rPr>
+          <w:rFonts w:ascii="Tahoma" w:hAnsi="Tahoma" w:cs="Tahoma" w:eastAsia="Tahoma"/>
+          <w:b/>
+          <w:sz w:val="24"/>
+          <w:rtl w:val="1"/>
+          <w:cs/>
+        </w:rPr>
+        <w:t>گام ۴ — آیکون دسکتاپ (اختیاری)</w:t>
+      </w:r>
+    </w:p>
+    <w:p>
+      <w:pPr>
+        <w:bidi w:val="1"/>
+        <w:jc w:val="right"/>
+      </w:pPr>
+      <w:r>
+        <w:rPr>
+          <w:rFonts w:ascii="Tahoma" w:hAnsi="Tahoma" w:cs="Tahoma" w:eastAsia="Tahoma"/>
+          <w:b w:val="0"/>
+          <w:sz w:val="24"/>
+          <w:rtl w:val="1"/>
+          <w:cs/>
+        </w:rPr>
+        <w:t>یک‌بار نصب_میانبر_سیرمان.bat را اجرا کنید و گزینه ۲ را بزنید.</w:t>
+      </w:r>
+    </w:p>
+    <w:p>
+      <w:pPr>
+        <w:pStyle w:val="Heading3"/>
+        <w:bidi w:val="1"/>
+        <w:jc w:val="right"/>
+      </w:pPr>
+      <w:r>
+        <w:rPr>
+          <w:rFonts w:ascii="Tahoma" w:hAnsi="Tahoma" w:cs="Tahoma" w:eastAsia="Tahoma"/>
+          <w:b/>
+          <w:sz w:val="24"/>
+          <w:rtl w:val="1"/>
+          <w:cs/>
+        </w:rPr>
+        <w:t>گام ۵</w:t>
+      </w:r>
+    </w:p>
+    <w:p>
+      <w:pPr>
+        <w:bidi w:val="1"/>
+        <w:jc w:val="right"/>
+      </w:pPr>
+      <w:r>
+        <w:rPr>
+          <w:rFonts w:ascii="Tahoma" w:hAnsi="Tahoma" w:cs="Tahoma" w:eastAsia="Tahoma"/>
+          <w:b w:val="0"/>
+          <w:sz w:val="24"/>
+          <w:rtl w:val="1"/>
+          <w:cs/>
+        </w:rPr>
+        <w:t>پایین منوی راست نسخه را ببینید. باید ۱۴۰۵.۵.۲۳ν باشد. تمام. برنامه نصب شد.</w:t>
+      </w:r>
+    </w:p>
+    <w:p>
+      <w:pPr>
+        <w:bidi w:val="1"/>
+        <w:jc w:val="right"/>
+      </w:pPr>
+      <w:r>
+        <w:rPr>
+          <w:rFonts w:ascii="Tahoma" w:hAnsi="Tahoma" w:cs="Tahoma" w:eastAsia="Tahoma"/>
+          <w:b w:val="0"/>
+          <w:sz w:val="24"/>
+          <w:rtl w:val="1"/>
+          <w:cs/>
+        </w:rPr>
+        <w:t>اگر با Sirman_Start.bat باز کردید پنجره مشکی را نبندید. آدرس معمولاً http://127.0.0.1:8765/Sirman_Final.html است.</w:t>
+      </w:r>
+    </w:p>
+    <w:p>
+      <w:pPr>
+        <w:pStyle w:val="Heading2"/>
+        <w:bidi w:val="1"/>
+        <w:jc w:val="right"/>
+      </w:pPr>
+      <w:r>
+        <w:rPr>
+          <w:rFonts w:ascii="Tahoma" w:hAnsi="Tahoma" w:cs="Tahoma" w:eastAsia="Tahoma"/>
+          <w:b/>
+          <w:sz w:val="24"/>
+          <w:rtl w:val="1"/>
+          <w:cs/>
+        </w:rPr>
+        <w:t>۴) روش ۲ — نصب با پنجره ویندوز (Sirman.exe)</w:t>
+      </w:r>
+    </w:p>
+    <w:p>
+      <w:pPr>
+        <w:bidi w:val="1"/>
+        <w:jc w:val="right"/>
+      </w:pPr>
+      <w:r>
+        <w:rPr>
+          <w:rFonts w:ascii="Tahoma" w:hAnsi="Tahoma" w:cs="Tahoma" w:eastAsia="Tahoma"/>
+          <w:b w:val="0"/>
+          <w:sz w:val="24"/>
+          <w:rtl w:val="1"/>
+          <w:cs/>
+        </w:rPr>
+        <w:t>وقتی می‌خواهید برنامه در پنجره خودش باز شود. هسته حساب این نسخه داخل exe است؛ برای آن مسیر exe جدید لازم است.</w:t>
+      </w:r>
+    </w:p>
+    <w:p>
+      <w:pPr>
+        <w:pStyle w:val="Heading3"/>
+        <w:bidi w:val="1"/>
+        <w:jc w:val="right"/>
+      </w:pPr>
+      <w:r>
+        <w:rPr>
+          <w:rFonts w:ascii="Tahoma" w:hAnsi="Tahoma" w:cs="Tahoma" w:eastAsia="Tahoma"/>
+          <w:b/>
+          <w:sz w:val="24"/>
+          <w:rtl w:val="1"/>
+          <w:cs/>
+        </w:rPr>
+        <w:t>پیش‌نیاز (فقط برای ساخت exe)</w:t>
       </w:r>
     </w:p>
     <w:p>
       <w:pPr>
         <w:pStyle w:val="ListBullet"/>
+        <w:bidi w:val="1"/>
         <w:jc w:val="right"/>
       </w:pPr>
       <w:r>
+        <w:rPr>
+          <w:rFonts w:ascii="Tahoma" w:hAnsi="Tahoma" w:cs="Tahoma" w:eastAsia="Tahoma"/>
+          <w:sz w:val="24"/>
+          <w:rtl w:val="1"/>
+          <w:cs/>
+        </w:rPr>
+        <w:t>.NET 8 SDK از https://dotnet.microsoft.com/download/dotnet/8.0</w:t>
+      </w:r>
+    </w:p>
+    <w:p>
+      <w:pPr>
+        <w:pStyle w:val="ListBullet"/>
+        <w:bidi w:val="1"/>
+        <w:jc w:val="right"/>
+      </w:pPr>
+      <w:r>
+        <w:rPr>
+          <w:rFonts w:ascii="Tahoma" w:hAnsi="Tahoma" w:cs="Tahoma" w:eastAsia="Tahoma"/>
+          <w:sz w:val="24"/>
+          <w:rtl w:val="1"/>
+          <w:cs/>
+        </w:rPr>
+        <w:t>WebView2 Runtime — معمولاً با Edge هست. اگر نبود از سایت مایکروسافت نصب کنید.</w:t>
+      </w:r>
+    </w:p>
+    <w:p>
+      <w:pPr>
+        <w:pStyle w:val="Heading3"/>
+        <w:bidi w:val="1"/>
+        <w:jc w:val="right"/>
+      </w:pPr>
+      <w:r>
+        <w:rPr>
+          <w:rFonts w:ascii="Tahoma" w:hAnsi="Tahoma" w:cs="Tahoma" w:eastAsia="Tahoma"/>
+          <w:b/>
+          <w:sz w:val="24"/>
+          <w:rtl w:val="1"/>
+          <w:cs/>
+        </w:rPr>
+        <w:t>گام‌ها</w:t>
+      </w:r>
+    </w:p>
+    <w:p>
+      <w:pPr>
+        <w:pStyle w:val="ListBullet"/>
+        <w:bidi w:val="1"/>
+        <w:jc w:val="right"/>
+      </w:pPr>
+      <w:r>
+        <w:rPr>
+          <w:rFonts w:ascii="Tahoma" w:hAnsi="Tahoma" w:cs="Tahoma" w:eastAsia="Tahoma"/>
+          <w:sz w:val="24"/>
+          <w:rtl w:val="1"/>
+          <w:cs/>
+        </w:rPr>
+        <w:t>پوشه desktop\Sirman_Windows_Install را کامل روی ویندوز کپی کنید.</w:t>
+      </w:r>
+    </w:p>
+    <w:p>
+      <w:pPr>
+        <w:pStyle w:val="ListBullet"/>
+        <w:bidi w:val="1"/>
+        <w:jc w:val="right"/>
+      </w:pPr>
+      <w:r>
+        <w:rPr>
+          <w:rFonts w:ascii="Tahoma" w:hAnsi="Tahoma" w:cs="Tahoma" w:eastAsia="Tahoma"/>
+          <w:sz w:val="24"/>
+          <w:rtl w:val="1"/>
+          <w:cs/>
+        </w:rPr>
+        <w:t>روی build-win.bat دوبار کلیک کنید تا پوشه publish و Sirman.exe ساخته شود. اگر گفت dotnet پیدا نشد، SDK نصب نیست.</w:t>
+      </w:r>
+    </w:p>
+    <w:p>
+      <w:pPr>
+        <w:pStyle w:val="ListBullet"/>
+        <w:bidi w:val="1"/>
+        <w:jc w:val="right"/>
+      </w:pPr>
+      <w:r>
+        <w:rPr>
+          <w:rFonts w:ascii="Tahoma" w:hAnsi="Tahoma" w:cs="Tahoma" w:eastAsia="Tahoma"/>
+          <w:sz w:val="24"/>
+          <w:rtl w:val="1"/>
+          <w:cs/>
+        </w:rPr>
+        <w:t>روی نصب_سیرمان.bat دوبار کلیک کنید، پوشه نصب را انتخاب کنید (مثلاً Documents\Sirman)، در صورت تمایل میانبر دسکتاپ بسازید.</w:t>
+      </w:r>
+    </w:p>
+    <w:p>
+      <w:pPr>
+        <w:pStyle w:val="ListBullet"/>
+        <w:bidi w:val="1"/>
+        <w:jc w:val="right"/>
+      </w:pPr>
+      <w:r>
+        <w:rPr>
+          <w:rFonts w:ascii="Tahoma" w:hAnsi="Tahoma" w:cs="Tahoma" w:eastAsia="Tahoma"/>
+          <w:sz w:val="24"/>
+          <w:rtl w:val="1"/>
+          <w:cs/>
+        </w:rPr>
+        <w:t>از منوی Start «سیرمان» را باز کنید.</w:t>
+      </w:r>
+    </w:p>
+    <w:p>
+      <w:pPr>
+        <w:bidi w:val="1"/>
+        <w:jc w:val="right"/>
+      </w:pPr>
+      <w:r>
+        <w:rPr>
+          <w:rFonts w:ascii="Tahoma" w:hAnsi="Tahoma" w:cs="Tahoma" w:eastAsia="Tahoma"/>
+          <w:b w:val="0"/>
+          <w:sz w:val="24"/>
+          <w:rtl w:val="1"/>
+          <w:cs/>
+        </w:rPr>
+        <w:t>حذف: منوی Start → حذف سیرمان، یا Uninstall-Sirman.bat کنار exe.</w:t>
+      </w:r>
+    </w:p>
+    <w:p>
+      <w:pPr>
+        <w:pStyle w:val="Heading2"/>
+        <w:bidi w:val="1"/>
+        <w:jc w:val="right"/>
+      </w:pPr>
+      <w:r>
+        <w:rPr>
+          <w:rFonts w:ascii="Tahoma" w:hAnsi="Tahoma" w:cs="Tahoma" w:eastAsia="Tahoma"/>
+          <w:b/>
+          <w:sz w:val="24"/>
+          <w:rtl w:val="1"/>
+          <w:cs/>
+        </w:rPr>
+        <w:t>۵) روش ۳ — اگر Sirman.exe آماده به شما دادند</w:t>
+      </w:r>
+    </w:p>
+    <w:p>
+      <w:pPr>
+        <w:pStyle w:val="ListBullet"/>
+        <w:bidi w:val="1"/>
+        <w:jc w:val="right"/>
+      </w:pPr>
+      <w:r>
+        <w:rPr>
+          <w:rFonts w:ascii="Tahoma" w:hAnsi="Tahoma" w:cs="Tahoma" w:eastAsia="Tahoma"/>
+          <w:sz w:val="24"/>
+          <w:rtl w:val="1"/>
+          <w:cs/>
+        </w:rPr>
+        <w:t>کل پوشه را کپی کنید.</w:t>
+      </w:r>
+    </w:p>
+    <w:p>
+      <w:pPr>
+        <w:pStyle w:val="ListBullet"/>
+        <w:bidi w:val="1"/>
+        <w:jc w:val="right"/>
+      </w:pPr>
+      <w:r>
+        <w:rPr>
+          <w:rFonts w:ascii="Tahoma" w:hAnsi="Tahoma" w:cs="Tahoma" w:eastAsia="Tahoma"/>
+          <w:sz w:val="24"/>
+          <w:rtl w:val="1"/>
+          <w:cs/>
+        </w:rPr>
+        <w:t>باید Sirman.exe و Sirman_Final.html کنار هم باشند.</w:t>
+      </w:r>
+    </w:p>
+    <w:p>
+      <w:pPr>
+        <w:pStyle w:val="ListBullet"/>
+        <w:bidi w:val="1"/>
+        <w:jc w:val="right"/>
+      </w:pPr>
+      <w:r>
+        <w:rPr>
+          <w:rFonts w:ascii="Tahoma" w:hAnsi="Tahoma" w:cs="Tahoma" w:eastAsia="Tahoma"/>
+          <w:sz w:val="24"/>
+          <w:rtl w:val="1"/>
+          <w:cs/>
+        </w:rPr>
         <w:t>روی Sirman.exe دوبار کلیک کنید.</w:t>
       </w:r>
     </w:p>
     <w:p>
       <w:pPr>
-        <w:pStyle w:val="ListBullet"/>
+        <w:bidi w:val="1"/>
         <w:jc w:val="right"/>
       </w:pPr>
       <w:r>
-        <w:t>برای آیکون دسکتاپ و منوی Start، یک‌بار فایل «نصب_میانبر_سیرمان.bat» را اجرا کنید.</w:t>
+        <w:rPr>
+          <w:rFonts w:ascii="Tahoma" w:hAnsi="Tahoma" w:cs="Tahoma" w:eastAsia="Tahoma"/>
+          <w:b w:val="0"/>
+          <w:sz w:val="24"/>
+          <w:rtl w:val="1"/>
+          <w:cs/>
+        </w:rPr>
+        <w:t>بدون HTML کنار exe، پنجره خالی یا خطا می‌دهد.</w:t>
       </w:r>
     </w:p>
     <w:p>
       <w:pPr>
-        <w:pStyle w:val="Heading3"/>
+        <w:pStyle w:val="Heading2"/>
+        <w:bidi w:val="1"/>
         <w:jc w:val="right"/>
       </w:pPr>
       <w:r>
-        <w:t>راه ۲ — لانچر ویندوز</w:t>
+        <w:rPr>
+          <w:rFonts w:ascii="Tahoma" w:hAnsi="Tahoma" w:cs="Tahoma" w:eastAsia="Tahoma"/>
+          <w:b/>
+          <w:sz w:val="24"/>
+          <w:rtl w:val="1"/>
+          <w:cs/>
+        </w:rPr>
+        <w:t>۶) بعد از نصب — اولین کارها و جای داده</w:t>
       </w:r>
     </w:p>
     <w:p>
       <w:pPr>
         <w:pStyle w:val="ListBullet"/>
+        <w:bidi w:val="1"/>
         <w:jc w:val="right"/>
       </w:pPr>
       <w:r>
-        <w:t>روی Sirman_Start.bat (یا «اجرای سیرمان.bat») دوبار کلیک کنید.</w:t>
+        <w:rPr>
+          <w:rFonts w:ascii="Tahoma" w:hAnsi="Tahoma" w:cs="Tahoma" w:eastAsia="Tahoma"/>
+          <w:sz w:val="24"/>
+          <w:rtl w:val="1"/>
+          <w:cs/>
+        </w:rPr>
+        <w:t>نسخه پایین سایدبار را چک کنید: ۱۴۰۵.۵.۲۳ν</w:t>
       </w:r>
     </w:p>
     <w:p>
       <w:pPr>
         <w:pStyle w:val="ListBullet"/>
+        <w:bidi w:val="1"/>
         <w:jc w:val="right"/>
       </w:pPr>
       <w:r>
-        <w:t>پنجره مشکی را نبندید؛ برنامه در مرورگر باز می‌شود.</w:t>
+        <w:rPr>
+          <w:rFonts w:ascii="Tahoma" w:hAnsi="Tahoma" w:cs="Tahoma" w:eastAsia="Tahoma"/>
+          <w:sz w:val="24"/>
+          <w:rtl w:val="1"/>
+          <w:cs/>
+        </w:rPr>
+        <w:t>از «ورود/خروج داده» یک بک‌آپ بگیرید و جایی امن بگذارید.</w:t>
       </w:r>
     </w:p>
     <w:p>
       <w:pPr>
         <w:pStyle w:val="ListBullet"/>
+        <w:bidi w:val="1"/>
         <w:jc w:val="right"/>
       </w:pPr>
       <w:r>
-        <w:t>آدرس معمولاً http://127.0.0.1:8765/Sirman_Final.html است.</w:t>
+        <w:rPr>
+          <w:rFonts w:ascii="Tahoma" w:hAnsi="Tahoma" w:cs="Tahoma" w:eastAsia="Tahoma"/>
+          <w:sz w:val="24"/>
+          <w:rtl w:val="1"/>
+          <w:cs/>
+        </w:rPr>
+        <w:t>بعد کالا، قطعه و حساب را تعریف کنید؛ سپس فاکتور و گارانتی.</w:t>
       </w:r>
     </w:p>
     <w:p>
       <w:pPr>
-        <w:pStyle w:val="Heading3"/>
+        <w:bidi w:val="1"/>
         <w:jc w:val="right"/>
       </w:pPr>
       <w:r>
-        <w:t>راه ۳ — فقط فایل HTML</w:t>
+        <w:rPr>
+          <w:rFonts w:ascii="Tahoma" w:hAnsi="Tahoma" w:cs="Tahoma" w:eastAsia="Tahoma"/>
+          <w:b/>
+          <w:sz w:val="24"/>
+          <w:rtl w:val="1"/>
+          <w:cs/>
+        </w:rPr>
+        <w:t>فاکتور و گارانتی داخل فایل HTML نیست. در حافظه همین مرورگر یا همین exe روی همین کامپیوتر است.</w:t>
       </w:r>
     </w:p>
     <w:p>
       <w:pPr>
         <w:pStyle w:val="ListBullet"/>
+        <w:bidi w:val="1"/>
         <w:jc w:val="right"/>
       </w:pPr>
       <w:r>
-        <w:t>روی Sirman_Final.html دوبار کلیک کنید.</w:t>
+        <w:rPr>
+          <w:rFonts w:ascii="Tahoma" w:hAnsi="Tahoma" w:cs="Tahoma" w:eastAsia="Tahoma"/>
+          <w:sz w:val="24"/>
+          <w:rtl w:val="1"/>
+          <w:cs/>
+        </w:rPr>
+        <w:t>اگر فقط فایل را به کامپیوتر دیگر ببرید، آنجا برنامه خالی باز می‌شود.</w:t>
       </w:r>
     </w:p>
     <w:p>
       <w:pPr>
         <w:pStyle w:val="ListBullet"/>
+        <w:bidi w:val="1"/>
         <w:jc w:val="right"/>
       </w:pPr>
       <w:r>
-        <w:t>همه کارها انجام می‌شود. فقط اعلان ویندوز ممکن است کامل نباشد.</w:t>
+        <w:rPr>
+          <w:rFonts w:ascii="Tahoma" w:hAnsi="Tahoma" w:cs="Tahoma" w:eastAsia="Tahoma"/>
+          <w:sz w:val="24"/>
+          <w:rtl w:val="1"/>
+          <w:cs/>
+        </w:rPr>
+        <w:t>قبل از جابه‌جایی از «ورود/خروج داده» بک‌آپ بگیرید.</w:t>
+      </w:r>
+    </w:p>
+    <w:p>
+      <w:pPr>
+        <w:pStyle w:val="ListBullet"/>
+        <w:bidi w:val="1"/>
+        <w:jc w:val="right"/>
+      </w:pPr>
+      <w:r>
+        <w:rPr>
+          <w:rFonts w:ascii="Tahoma" w:hAnsi="Tahoma" w:cs="Tahoma" w:eastAsia="Tahoma"/>
+          <w:sz w:val="24"/>
+          <w:rtl w:val="1"/>
+          <w:cs/>
+        </w:rPr>
+        <w:t>روی کامپیوتر جدید همان بک‌آپ را با حالت جایگزینی برگردانید.</w:t>
       </w:r>
     </w:p>
     <w:p>
       <w:pPr>
         <w:pStyle w:val="Heading2"/>
-        <w:jc w:val="right"/>
-      </w:pPr>
-      <w:r>
-        <w:t>۳. داده کجاست؟ خیلی مهم</w:t>
-      </w:r>
-    </w:p>
-    <w:p>
-      <w:pPr>
+        <w:bidi w:val="1"/>
         <w:jc w:val="right"/>
       </w:pPr>
       <w:r>
         <w:rPr>
-          <w:b w:val="0"/>
+          <w:rFonts w:ascii="Tahoma" w:hAnsi="Tahoma" w:cs="Tahoma" w:eastAsia="Tahoma"/>
+          <w:b/>
           <w:sz w:val="24"/>
+          <w:rtl w:val="1"/>
+          <w:cs/>
         </w:rPr>
-        <w:t>فاکتور، گارانتی، انبار و مخاطب داخل فایل HTML نیست.</w:t>
-      </w:r>
-    </w:p>
-    <w:p>
-      <w:pPr>
-        <w:jc w:val="right"/>
-      </w:pPr>
-      <w:r>
-        <w:rPr>
-          <w:b w:val="0"/>
-          <w:sz w:val="24"/>
-        </w:rPr>
-        <w:t>در حافظه همین مرورگر (یا همین exe) روی همین کامپیوتر ذخیره می‌شود.</w:t>
+        <w:t>۷) اگر قبلاً برنامه را دارید (آپدیت، نه نصب اول)</w:t>
       </w:r>
     </w:p>
     <w:p>
       <w:pPr>
         <w:pStyle w:val="ListBullet"/>
+        <w:bidi w:val="1"/>
         <w:jc w:val="right"/>
       </w:pPr>
       <w:r>
-        <w:t>اگر فقط فایل را کپی کنید، روی کامپیوتر جدید برنامه خالی باز می‌شود.</w:t>
+        <w:rPr>
+          <w:rFonts w:ascii="Tahoma" w:hAnsi="Tahoma" w:cs="Tahoma" w:eastAsia="Tahoma"/>
+          <w:sz w:val="24"/>
+          <w:rtl w:val="1"/>
+          <w:cs/>
+        </w:rPr>
+        <w:t>از «ورود/خروج داده» بک‌آپ کامل بگیرید.</w:t>
       </w:r>
     </w:p>
     <w:p>
       <w:pPr>
         <w:pStyle w:val="ListBullet"/>
+        <w:bidi w:val="1"/>
         <w:jc w:val="right"/>
       </w:pPr>
       <w:r>
-        <w:t>قبل از جابه‌جایی حتماً از بخش «ورود/خروج داده» بک‌آپ بگیرید.</w:t>
+        <w:rPr>
+          <w:rFonts w:ascii="Tahoma" w:hAnsi="Tahoma" w:cs="Tahoma" w:eastAsia="Tahoma"/>
+          <w:sz w:val="24"/>
+          <w:rtl w:val="1"/>
+          <w:cs/>
+        </w:rPr>
+        <w:t>Sirman_Final.html جدید را جایگزین کنید (حدود ۱٫۶ مگابایت، نه ۱ کیلوبایت).</w:t>
       </w:r>
     </w:p>
     <w:p>
       <w:pPr>
         <w:pStyle w:val="ListBullet"/>
+        <w:bidi w:val="1"/>
         <w:jc w:val="right"/>
       </w:pPr>
       <w:r>
-        <w:t>روی کامپیوتر جدید همان بک‌آپ را با حالت «جایگزینی» برگردانید.</w:t>
+        <w:rPr>
+          <w:rFonts w:ascii="Tahoma" w:hAnsi="Tahoma" w:cs="Tahoma" w:eastAsia="Tahoma"/>
+          <w:sz w:val="24"/>
+          <w:rtl w:val="1"/>
+          <w:cs/>
+        </w:rPr>
+        <w:t>اگر با exe کار می‌کنید: HTML به‌تنهایی کافی نیست. exe جدید هم لازم است (دوباره build-win.bat). هسته حساب داخل پوسته است.</w:t>
+      </w:r>
+    </w:p>
+    <w:p>
+      <w:pPr>
+        <w:pStyle w:val="ListBullet"/>
+        <w:bidi w:val="1"/>
+        <w:jc w:val="right"/>
+      </w:pPr>
+      <w:r>
+        <w:rPr>
+          <w:rFonts w:ascii="Tahoma" w:hAnsi="Tahoma" w:cs="Tahoma" w:eastAsia="Tahoma"/>
+          <w:sz w:val="24"/>
+          <w:rtl w:val="1"/>
+          <w:cs/>
+        </w:rPr>
+        <w:t>لانچر Sirman_Start.bat را هم اگر همراه بسته آمده جایگزین کنید.</w:t>
+      </w:r>
+    </w:p>
+    <w:p>
+      <w:pPr>
+        <w:pStyle w:val="ListBullet"/>
+        <w:bidi w:val="1"/>
+        <w:jc w:val="right"/>
+      </w:pPr>
+      <w:r>
+        <w:rPr>
+          <w:rFonts w:ascii="Tahoma" w:hAnsi="Tahoma" w:cs="Tahoma" w:eastAsia="Tahoma"/>
+          <w:sz w:val="24"/>
+          <w:rtl w:val="1"/>
+          <w:cs/>
+        </w:rPr>
+        <w:t>برنامه را باز کنید. نسخه باید ۱۴۰۵.۵.۲۳ν باشد و فاکتور قبلی سر جایش.</w:t>
+      </w:r>
+    </w:p>
+    <w:p>
+      <w:pPr>
+        <w:bidi w:val="1"/>
+        <w:jc w:val="right"/>
+      </w:pPr>
+      <w:r>
+        <w:rPr>
+          <w:rFonts w:ascii="Tahoma" w:hAnsi="Tahoma" w:cs="Tahoma" w:eastAsia="Tahoma"/>
+          <w:b/>
+          <w:color w:val="B45309"/>
+          <w:sz w:val="24"/>
+          <w:rtl w:val="1"/>
+          <w:cs/>
+        </w:rPr>
+        <w:t>فایل JSON یک‌کیلوبایتی را به‌جای برنامه بارگذاری نکنید. برای این نسخه کافی نیست.</w:t>
       </w:r>
     </w:p>
     <w:p>
       <w:pPr>
         <w:pStyle w:val="Heading2"/>
+        <w:bidi w:val="1"/>
         <w:jc w:val="right"/>
       </w:pPr>
       <w:r>
-        <w:t>۴. آپدیت همین نسخه (۱۴۰۵.۵.۲۳μ)</w:t>
+        <w:rPr>
+          <w:rFonts w:ascii="Tahoma" w:hAnsi="Tahoma" w:cs="Tahoma" w:eastAsia="Tahoma"/>
+          <w:b/>
+          <w:sz w:val="24"/>
+          <w:rtl w:val="1"/>
+          <w:cs/>
+        </w:rPr>
+        <w:t>۸) فایل JSON آپدیت چیست؟</w:t>
       </w:r>
     </w:p>
     <w:p>
       <w:pPr>
+        <w:bidi w:val="1"/>
         <w:jc w:val="right"/>
       </w:pPr>
       <w:r>
         <w:rPr>
-          <w:b/>
+          <w:rFonts w:ascii="Tahoma" w:hAnsi="Tahoma" w:cs="Tahoma" w:eastAsia="Tahoma"/>
+          <w:b w:val="0"/>
           <w:sz w:val="24"/>
+          <w:rtl w:val="1"/>
+          <w:cs/>
         </w:rPr>
-        <w:t>فایل کوچک JSON فقط شماره نسخه را عوض می‌کند. برای این نسخه کافی نیست.</w:t>
+        <w:t>پوشه updates فقط برای آپدیت خیلی کوچک بعدی است (مثلاً یک رنگ). مسیر: تنظیمات → تب آپدیت → بارگذاری فایل آپدیت. یا نام فایل را Sirman_Pending_Update.json بگذارید کنار Sirman_Start.bat.</w:t>
       </w:r>
     </w:p>
     <w:p>
       <w:pPr>
-        <w:pStyle w:val="Heading3"/>
+        <w:bidi w:val="1"/>
         <w:jc w:val="right"/>
       </w:pPr>
       <w:r>
-        <w:t>اگر با HTML کار می‌کنید</w:t>
+        <w:rPr>
+          <w:rFonts w:ascii="Tahoma" w:hAnsi="Tahoma" w:cs="Tahoma" w:eastAsia="Tahoma"/>
+          <w:b w:val="0"/>
+          <w:sz w:val="24"/>
+          <w:rtl w:val="1"/>
+          <w:cs/>
+        </w:rPr>
+        <w:t>اگر آپدیت به‌هم ریخت، در همان تب از دانگرید به هسته قبلی برگردید. داده پاک نمی‌شود.</w:t>
+      </w:r>
+    </w:p>
+    <w:p>
+      <w:pPr>
+        <w:pStyle w:val="Heading2"/>
+        <w:bidi w:val="1"/>
+        <w:jc w:val="right"/>
+      </w:pPr>
+      <w:r>
+        <w:rPr>
+          <w:rFonts w:ascii="Tahoma" w:hAnsi="Tahoma" w:cs="Tahoma" w:eastAsia="Tahoma"/>
+          <w:b/>
+          <w:sz w:val="24"/>
+          <w:rtl w:val="1"/>
+          <w:cs/>
+        </w:rPr>
+        <w:t>۹) چک درست نصب شدن</w:t>
       </w:r>
     </w:p>
     <w:p>
       <w:pPr>
         <w:pStyle w:val="ListBullet"/>
+        <w:bidi w:val="1"/>
         <w:jc w:val="right"/>
       </w:pPr>
       <w:r>
-        <w:t>یک بک‌آپ بگیرید.</w:t>
+        <w:rPr>
+          <w:rFonts w:ascii="Tahoma" w:hAnsi="Tahoma" w:cs="Tahoma" w:eastAsia="Tahoma"/>
+          <w:sz w:val="24"/>
+          <w:rtl w:val="1"/>
+          <w:cs/>
+        </w:rPr>
+        <w:t>حجم Sirman_Final.html حدود ۱٫۶ مگابایت است.</w:t>
       </w:r>
     </w:p>
     <w:p>
       <w:pPr>
         <w:pStyle w:val="ListBullet"/>
+        <w:bidi w:val="1"/>
         <w:jc w:val="right"/>
       </w:pPr>
       <w:r>
-        <w:t>فایل Sirman_Final.html جدید را جایگزین فایل قبلی کنید (همان پوشه، همان نام).</w:t>
+        <w:rPr>
+          <w:rFonts w:ascii="Tahoma" w:hAnsi="Tahoma" w:cs="Tahoma" w:eastAsia="Tahoma"/>
+          <w:sz w:val="24"/>
+          <w:rtl w:val="1"/>
+          <w:cs/>
+        </w:rPr>
+        <w:t>برنامه باز می‌شود و قفل نمی‌شود.</w:t>
       </w:r>
     </w:p>
     <w:p>
       <w:pPr>
         <w:pStyle w:val="ListBullet"/>
+        <w:bidi w:val="1"/>
         <w:jc w:val="right"/>
       </w:pPr>
       <w:r>
-        <w:t>برنامه را دوباره باز کنید.</w:t>
+        <w:rPr>
+          <w:rFonts w:ascii="Tahoma" w:hAnsi="Tahoma" w:cs="Tahoma" w:eastAsia="Tahoma"/>
+          <w:sz w:val="24"/>
+          <w:rtl w:val="1"/>
+          <w:cs/>
+        </w:rPr>
+        <w:t>پایین سایدبار نسخه ۱۴۰۵.۵.۲۳ν است.</w:t>
       </w:r>
     </w:p>
     <w:p>
       <w:pPr>
         <w:pStyle w:val="ListBullet"/>
+        <w:bidi w:val="1"/>
         <w:jc w:val="right"/>
       </w:pPr>
       <w:r>
-        <w:t>نسخه پایین سایدبار باید ۱۴۰۵.۵.۲۳μ باشد.</w:t>
+        <w:rPr>
+          <w:rFonts w:ascii="Tahoma" w:hAnsi="Tahoma" w:cs="Tahoma" w:eastAsia="Tahoma"/>
+          <w:sz w:val="24"/>
+          <w:rtl w:val="1"/>
+          <w:cs/>
+        </w:rPr>
+        <w:t>اگر داده قبلی داشتید، فاکتور و گارانتی هنوز هستند.</w:t>
       </w:r>
     </w:p>
     <w:p>
       <w:pPr>
-        <w:pStyle w:val="Heading3"/>
+        <w:pStyle w:val="Heading2"/>
+        <w:bidi w:val="1"/>
         <w:jc w:val="right"/>
       </w:pPr>
       <w:r>
-        <w:t>اگر با exe ویندوز کار می‌کنید</w:t>
+        <w:rPr>
+          <w:rFonts w:ascii="Tahoma" w:hAnsi="Tahoma" w:cs="Tahoma" w:eastAsia="Tahoma"/>
+          <w:b/>
+          <w:sz w:val="24"/>
+          <w:rtl w:val="1"/>
+          <w:cs/>
+        </w:rPr>
+        <w:t>۱۰) اگر باز نشد</w:t>
       </w:r>
     </w:p>
     <w:p>
       <w:pPr>
         <w:pStyle w:val="ListBullet"/>
+        <w:bidi w:val="1"/>
         <w:jc w:val="right"/>
       </w:pPr>
       <w:r>
-        <w:t>یک بک‌آپ بگیرید.</w:t>
+        <w:rPr>
+          <w:rFonts w:ascii="Tahoma" w:hAnsi="Tahoma" w:cs="Tahoma" w:eastAsia="Tahoma"/>
+          <w:sz w:val="24"/>
+          <w:rtl w:val="1"/>
+          <w:cs/>
+        </w:rPr>
+        <w:t>HTML را با Chrome یا Edge باز کنید. اول از روی فلش روی هارد کپی کنید.</w:t>
       </w:r>
     </w:p>
     <w:p>
       <w:pPr>
         <w:pStyle w:val="ListBullet"/>
+        <w:bidi w:val="1"/>
         <w:jc w:val="right"/>
       </w:pPr>
       <w:r>
-        <w:t>هم فایل HTML جدید و هم exe جدید را جایگزین کنید.</w:t>
+        <w:rPr>
+          <w:rFonts w:ascii="Tahoma" w:hAnsi="Tahoma" w:cs="Tahoma" w:eastAsia="Tahoma"/>
+          <w:sz w:val="24"/>
+          <w:rtl w:val="1"/>
+          <w:cs/>
+        </w:rPr>
+        <w:t>اگر BAT گفت HTML نیست: Sirman_Final.html باید کنار همان BAT باشد.</w:t>
       </w:r>
     </w:p>
     <w:p>
       <w:pPr>
         <w:pStyle w:val="ListBullet"/>
+        <w:bidi w:val="1"/>
         <w:jc w:val="right"/>
       </w:pPr>
       <w:r>
-        <w:t>هسته حساب این نسخه داخل پوسته ویندوز است؛ فقط عوض کردن HTML کافی نیست.</w:t>
+        <w:rPr>
+          <w:rFonts w:ascii="Tahoma" w:hAnsi="Tahoma" w:cs="Tahoma" w:eastAsia="Tahoma"/>
+          <w:sz w:val="24"/>
+          <w:rtl w:val="1"/>
+          <w:cs/>
+        </w:rPr>
+        <w:t>اگر build-win کار نکرد: .NET 8 SDK نصب کنید، یک‌بار Restart، دوباره بزنید.</w:t>
       </w:r>
     </w:p>
     <w:p>
       <w:pPr>
         <w:pStyle w:val="ListBullet"/>
-        <w:jc w:val="right"/>
-      </w:pPr>
-      <w:r>
-        <w:t>لانچر Sirman_Start.bat را هم اگر همراه بسته آمده جایگزین کنید.</w:t>
-      </w:r>
-    </w:p>
-    <w:p>
-      <w:pPr>
-        <w:pStyle w:val="Heading2"/>
-        <w:jc w:val="right"/>
-      </w:pPr>
-      <w:r>
-        <w:t>۵. آپدیت کوچک بعدی (وقتی فایل JSON کامل دارید)</w:t>
-      </w:r>
-    </w:p>
-    <w:p>
-      <w:pPr>
+        <w:bidi w:val="1"/>
         <w:jc w:val="right"/>
       </w:pPr>
       <w:r>
         <w:rPr>
-          <w:b w:val="0"/>
+          <w:rFonts w:ascii="Tahoma" w:hAnsi="Tahoma" w:cs="Tahoma" w:eastAsia="Tahoma"/>
           <w:sz w:val="24"/>
+          <w:rtl w:val="1"/>
+          <w:cs/>
         </w:rPr>
-        <w:t>مسیر داخل برنامه عوض نشده:</w:t>
+        <w:t>اگر exe صفحه سفید داد: HTML را کنار exe بگذارید و WebView2 را نصب کنید.</w:t>
       </w:r>
     </w:p>
     <w:p>
       <w:pPr>
         <w:pStyle w:val="ListBullet"/>
+        <w:bidi w:val="1"/>
         <w:jc w:val="right"/>
       </w:pPr>
       <w:r>
-        <w:t>تنظیمات → تب ⬆️ آپدیت → دکمه «بارگذاری فایل آپدیت».</w:t>
+        <w:rPr>
+          <w:rFonts w:ascii="Tahoma" w:hAnsi="Tahoma" w:cs="Tahoma" w:eastAsia="Tahoma"/>
+          <w:sz w:val="24"/>
+          <w:rtl w:val="1"/>
+          <w:cs/>
+        </w:rPr>
+        <w:t>اگر برنامه خالی است: فایل برنامه داده را جابه‌جا نمی‌کند. بک‌آپ را برگردانید.</w:t>
       </w:r>
     </w:p>
     <w:p>
       <w:pPr>
-        <w:pStyle w:val="ListBullet"/>
-        <w:jc w:val="right"/>
-      </w:pPr>
-      <w:r>
-        <w:t>یا فایل را با نام Sirman_Pending_Update.json کنار Sirman_Start.bat بگذارید و Start را بزنید.</w:t>
-      </w:r>
-    </w:p>
-    <w:p>
-      <w:pPr>
-        <w:pStyle w:val="ListBullet"/>
-        <w:jc w:val="right"/>
-      </w:pPr>
-      <w:r>
-        <w:t>نسخه پایین سایدبار عوض می‌شود و در تاریخچه آپدیت ثبت می‌ماند.</w:t>
-      </w:r>
-    </w:p>
-    <w:p>
-      <w:pPr>
+        <w:bidi w:val="1"/>
         <w:jc w:val="right"/>
       </w:pPr>
       <w:r>
         <w:rPr>
+          <w:rFonts w:ascii="Tahoma" w:hAnsi="Tahoma" w:cs="Tahoma" w:eastAsia="Tahoma"/>
           <w:b w:val="0"/>
           <w:sz w:val="24"/>
+          <w:rtl w:val="1"/>
+          <w:cs/>
         </w:rPr>
-        <w:t>اگر فایل آپدیت «آپدیت کامل» باشد، همان لحظه صفحه به نسخه جدید می‌رود و لازم نیست HTML را دستی جابه‌جا کنید.</w:t>
-      </w:r>
-    </w:p>
-    <w:p>
-      <w:pPr>
-        <w:pStyle w:val="Heading2"/>
-        <w:jc w:val="right"/>
-      </w:pPr>
-      <w:r>
-        <w:t>۶. قبل و بعد از آپدیت</w:t>
-      </w:r>
-    </w:p>
-    <w:p>
-      <w:pPr>
-        <w:jc w:val="right"/>
-      </w:pPr>
-      <w:r>
-        <w:rPr>
-          <w:b w:val="0"/>
-          <w:sz w:val="24"/>
-        </w:rPr>
-        <w:t>قبل:</w:t>
-      </w:r>
-    </w:p>
-    <w:p>
-      <w:pPr>
-        <w:pStyle w:val="ListBullet"/>
-        <w:jc w:val="right"/>
-      </w:pPr>
-      <w:r>
-        <w:t>از «ورود/خروج داده» یک بک‌آپ کامل دانلود کنید.</w:t>
-      </w:r>
-    </w:p>
-    <w:p>
-      <w:pPr>
-        <w:pStyle w:val="ListBullet"/>
-        <w:jc w:val="right"/>
-      </w:pPr>
-      <w:r>
-        <w:t>برنامه را ببندید (از ضربدر داخل برنامه، نه فقط بستن پنجره ویندوز).</w:t>
-      </w:r>
-    </w:p>
-    <w:p>
-      <w:pPr>
-        <w:jc w:val="right"/>
-      </w:pPr>
-      <w:r>
-        <w:rPr>
-          <w:b w:val="0"/>
-          <w:sz w:val="24"/>
-        </w:rPr>
-        <w:t>بعد:</w:t>
-      </w:r>
-    </w:p>
-    <w:p>
-      <w:pPr>
-        <w:pStyle w:val="ListBullet"/>
-        <w:jc w:val="right"/>
-      </w:pPr>
-      <w:r>
-        <w:t>نسخه پایین سایدبار را چک کنید.</w:t>
-      </w:r>
-    </w:p>
-    <w:p>
-      <w:pPr>
-        <w:pStyle w:val="ListBullet"/>
-        <w:jc w:val="right"/>
-      </w:pPr>
-      <w:r>
-        <w:t>یک فاکتور و یک پرونده گارانتی قبلی را باز کنید تا مطمئن شوید داده سر جایش است.</w:t>
-      </w:r>
-    </w:p>
-    <w:p>
-      <w:pPr>
-        <w:pStyle w:val="ListBullet"/>
-        <w:jc w:val="right"/>
-      </w:pPr>
-      <w:r>
-        <w:t>اگر exe دارید، یک فاکتور ببندید یا یک حواله ثبت کنید تا هسته جدید کار کند.</w:t>
-      </w:r>
-    </w:p>
-    <w:p>
-      <w:pPr>
-        <w:pStyle w:val="Heading2"/>
-        <w:jc w:val="right"/>
-      </w:pPr>
-      <w:r>
-        <w:t>۷. چند کامپیوتر / چند همکار</w:t>
-      </w:r>
-    </w:p>
-    <w:p>
-      <w:pPr>
-        <w:pStyle w:val="ListBullet"/>
-        <w:jc w:val="right"/>
-      </w:pPr>
-      <w:r>
-        <w:t>همان فایل HTML یا همان exe را به همه بدهید.</w:t>
-      </w:r>
-    </w:p>
-    <w:p>
-      <w:pPr>
-        <w:pStyle w:val="ListBullet"/>
-        <w:jc w:val="right"/>
-      </w:pPr>
-      <w:r>
-        <w:t>هر مرورگر حافظه جدا دارد؛ مگر اینکه از پوشه مشترک و بک‌آپ هماهنگ استفاده کنید.</w:t>
-      </w:r>
-    </w:p>
-    <w:p>
-      <w:pPr>
-        <w:pStyle w:val="ListBullet"/>
-        <w:jc w:val="right"/>
-      </w:pPr>
-      <w:r>
-        <w:t>برای شبکه داخلی دفتر: تنظیمات → شبکه. اینترنت عمومی لازم نیست.</w:t>
-      </w:r>
-    </w:p>
-    <w:p>
-      <w:pPr>
-        <w:pStyle w:val="Heading2"/>
-        <w:jc w:val="right"/>
-      </w:pPr>
-      <w:r>
-        <w:t>۸. اگر آپدیت به‌هم ریخت</w:t>
-      </w:r>
-    </w:p>
-    <w:p>
-      <w:pPr>
-        <w:pStyle w:val="ListBullet"/>
-        <w:jc w:val="right"/>
-      </w:pPr>
-      <w:r>
-        <w:t>تنظیمات → آپدیت → دانگرید به هسته یا آپدیت قبلی.</w:t>
-      </w:r>
-    </w:p>
-    <w:p>
-      <w:pPr>
-        <w:pStyle w:val="ListBullet"/>
-        <w:jc w:val="right"/>
-      </w:pPr>
-      <w:r>
-        <w:t>داده کسب‌وکار با دانگرید پاک نمی‌شود.</w:t>
-      </w:r>
-    </w:p>
-    <w:p>
-      <w:pPr>
-        <w:pStyle w:val="ListBullet"/>
-        <w:jc w:val="right"/>
-      </w:pPr>
-      <w:r>
-        <w:t>اگر صفحه باز نشد، HTML قبلی و بک‌آپ را برگردانید.</w:t>
-      </w:r>
-    </w:p>
-    <w:p>
-      <w:pPr>
-        <w:pStyle w:val="Heading2"/>
-        <w:jc w:val="right"/>
-      </w:pPr>
-      <w:r>
-        <w:t>۹. فایل‌های مهم پوشه برنامه</w:t>
-      </w:r>
-    </w:p>
-    <w:p>
-      <w:pPr>
-        <w:pStyle w:val="ListBullet"/>
-        <w:jc w:val="right"/>
-      </w:pPr>
-      <w:r>
-        <w:t>Sirman_Final.html — خود برنامه</w:t>
-      </w:r>
-    </w:p>
-    <w:p>
-      <w:pPr>
-        <w:pStyle w:val="ListBullet"/>
-        <w:jc w:val="right"/>
-      </w:pPr>
-      <w:r>
-        <w:t>Sirman_Start.bat — اجرا با سرور محلی</w:t>
-      </w:r>
-    </w:p>
-    <w:p>
-      <w:pPr>
-        <w:pStyle w:val="ListBullet"/>
-        <w:jc w:val="right"/>
-      </w:pPr>
-      <w:r>
-        <w:t>OPEN_SIRMAN.bat — باز کردن مستقیم HTML</w:t>
-      </w:r>
-    </w:p>
-    <w:p>
-      <w:pPr>
-        <w:pStyle w:val="ListBullet"/>
-        <w:jc w:val="right"/>
-      </w:pPr>
-      <w:r>
-        <w:t>نصب_میانبر_سیرمان.bat — آیکون دسکتاپ</w:t>
-      </w:r>
-    </w:p>
-    <w:p>
-      <w:pPr>
-        <w:pStyle w:val="ListBullet"/>
-        <w:jc w:val="right"/>
-      </w:pPr>
-      <w:r>
-        <w:t>Sirman.exe — پوسته ویندوز (اگر نصب شده)</w:t>
-      </w:r>
-    </w:p>
-    <w:p>
-      <w:pPr>
-        <w:pStyle w:val="ListBullet"/>
-        <w:jc w:val="right"/>
-      </w:pPr>
-      <w:r>
-        <w:t>ورود/خروج داده داخل خود برنامه — بک‌آپ و بازگردانی</w:t>
-      </w:r>
-    </w:p>
-    <w:p>
-      <w:pPr>
-        <w:pStyle w:val="Heading2"/>
-        <w:jc w:val="right"/>
-      </w:pPr>
-      <w:r>
-        <w:t>۱۰. این راهنما کجای برنامه است؟</w:t>
-      </w:r>
-    </w:p>
-    <w:p>
-      <w:pPr>
-        <w:jc w:val="right"/>
-      </w:pPr>
-      <w:r>
-        <w:rPr>
-          <w:b w:val="0"/>
-          <w:sz w:val="24"/>
-        </w:rPr>
-        <w:t>صفحه راهنما → دسته «آپدیت نرم‌افزار» → «راهنمای نصب و آپدیت (همین نسخه)».</w:t>
-      </w:r>
-    </w:p>
-    <w:p>
-      <w:pPr>
-        <w:jc w:val="right"/>
-      </w:pPr>
-      <w:r>
-        <w:rPr>
-          <w:b w:val="0"/>
-          <w:sz w:val="24"/>
-        </w:rPr>
-        <w:t>همین متن در فایل راهنمای_نصب_و_آپدیت.docx کنار برنامه هم هست.</w:t>
+        <w:t>داخل برنامه همین متن در راهنما → آپدیت نرم‌افزار → نصب از صفر هم هست.</w:t>
       </w:r>
     </w:p>
     <w:sectPr>
       <w:pgSz w:w="12240" w:h="15840"/>
-      <w:pgMar w:top="1440" w:right="1134" w:bottom="1440" w:left="1134" w:header="720" w:footer="720" w:gutter="0"/>
+      <w:pgMar w:top="907" w:right="1134" w:bottom="907" w:left="1134" w:header="720" w:footer="720" w:gutter="0"/>
       <w:cols w:space="720"/>
       <w:docGrid w:linePitch="360"/>
+      <w:bidi w:val="1"/>
     </w:sectPr>
   </w:body>
 </w:document>
@@ -1053,11 +1708,6 @@
     <w:name w:val="Normal"/>
     <w:qFormat/>
     <w:rsid w:val="00FC693F"/>
-    <w:rPr>
-      <w:rFonts w:ascii="Calibri" w:hAnsi="Calibri"/>
-      <w:sz w:val="24"/>
-      <w:rtl/>
-    </w:rPr>
   </w:style>
   <w:style w:type="paragraph" w:styleId="Header">
     <w:name w:val="header"/>

</xml_diff>

<commit_message>
feat: one-click Windows setup kit without copy-paste (1405.5.23ξ)
Ship Sirman_Setup zip with ready Sirman.exe, the full HTML app, and
نصب.bat / SETUP.bat that copies files to a chosen folder and creates
shortcuts. The 1KB JSON is not included in the kit.

Co-authored-by: estelami1366-ux <estelami1366-ux@users.noreply.github.com>
</commit_message>
<xml_diff>
--- a/desktop/Sirman_Install_Kit/راهنمای_نصب_و_آپدیت.docx
+++ b/desktop/Sirman_Install_Kit/راهنمای_نصب_و_آپدیت.docx
@@ -10,13 +10,12 @@
       </w:pPr>
       <w:r>
         <w:rPr>
-          <w:rFonts w:ascii="Tahoma" w:hAnsi="Tahoma" w:cs="Tahoma" w:eastAsia="Tahoma"/>
+          <w:rFonts w:ascii="Tahoma" w:hAnsi="Tahoma"/>
           <w:b/>
           <w:sz w:val="24"/>
           <w:rtl w:val="1"/>
-          <w:cs/>
         </w:rPr>
-        <w:t>راهنمای نصب سیرمان از صفر</w:t>
+        <w:t>نصب سیرمان با کیت Setup — بدون کپی‌پیست</w:t>
       </w:r>
     </w:p>
     <w:p>
@@ -26,13 +25,12 @@
       </w:pPr>
       <w:r>
         <w:rPr>
-          <w:rFonts w:ascii="Tahoma" w:hAnsi="Tahoma" w:cs="Tahoma" w:eastAsia="Tahoma"/>
-          <w:b w:val="0"/>
+          <w:rFonts w:ascii="Tahoma" w:hAnsi="Tahoma"/>
+          <w:b/>
           <w:sz w:val="24"/>
           <w:rtl w:val="1"/>
-          <w:cs/>
         </w:rPr>
-        <w:t>لایق الکترونیک پارسیان</w:t>
+        <w:t>نسخه ۱۴۰۵.۵.۲۳ξ</w:t>
       </w:r>
     </w:p>
     <w:p>
@@ -42,45 +40,13 @@
       </w:pPr>
       <w:r>
         <w:rPr>
-          <w:rFonts w:ascii="Tahoma" w:hAnsi="Tahoma" w:cs="Tahoma" w:eastAsia="Tahoma"/>
+          <w:rFonts w:ascii="Tahoma" w:hAnsi="Tahoma"/>
           <w:b/>
+          <w:color w:val="B45309"/>
           <w:sz w:val="24"/>
           <w:rtl w:val="1"/>
-          <w:cs/>
         </w:rPr>
-        <w:t>نسخه جاری نرم‌افزار: ۱۴۰۵.۵.۲۳ν</w:t>
-      </w:r>
-    </w:p>
-    <w:p>
-      <w:pPr>
-        <w:bidi w:val="1"/>
-        <w:jc w:val="right"/>
-      </w:pPr>
-      <w:r>
-        <w:rPr>
-          <w:rFonts w:ascii="Tahoma" w:hAnsi="Tahoma" w:cs="Tahoma" w:eastAsia="Tahoma"/>
-          <w:b w:val="0"/>
-          <w:sz w:val="24"/>
-          <w:rtl w:val="1"/>
-          <w:cs/>
-        </w:rPr>
-        <w:t>تاریخ: ۱۴۰۵/۰۵/۲۳</w:t>
-      </w:r>
-    </w:p>
-    <w:p>
-      <w:pPr>
-        <w:bidi w:val="1"/>
-        <w:jc w:val="right"/>
-      </w:pPr>
-      <w:r>
-        <w:rPr>
-          <w:rFonts w:ascii="Tahoma" w:hAnsi="Tahoma" w:cs="Tahoma" w:eastAsia="Tahoma"/>
-          <w:b w:val="0"/>
-          <w:sz w:val="24"/>
-          <w:rtl w:val="1"/>
-          <w:cs/>
-        </w:rPr>
-        <w:t>این راهنما برای کسی نوشته شده که تا حالا این برنامه را روی این کامپیوتر نداشته. از اول تا آخر پیش بروید.</w:t>
+        <w:t>فایل‌ها را یکی‌یکی کپی نکنید.</w:t>
       </w:r>
     </w:p>
     <w:p>
@@ -91,13 +57,102 @@
       </w:pPr>
       <w:r>
         <w:rPr>
-          <w:rFonts w:ascii="Tahoma" w:hAnsi="Tahoma" w:cs="Tahoma" w:eastAsia="Tahoma"/>
+          <w:rFonts w:ascii="Tahoma" w:hAnsi="Tahoma"/>
           <w:b/>
           <w:sz w:val="24"/>
           <w:rtl w:val="1"/>
-          <w:cs/>
         </w:rPr>
-        <w:t>۱) اول این را بخوانید — فایل یک‌کیلوبایتی برنامه نیست</w:t>
+        <w:t>۱) کیت کامل</w:t>
+      </w:r>
+    </w:p>
+    <w:p>
+      <w:pPr>
+        <w:pStyle w:val="ListNumber"/>
+        <w:bidi w:val="1"/>
+        <w:jc w:val="right"/>
+      </w:pPr>
+      <w:r>
+        <w:rPr>
+          <w:rFonts w:ascii="Tahoma" w:hAnsi="Tahoma"/>
+          <w:sz w:val="24"/>
+          <w:rtl w:val="1"/>
+        </w:rPr>
+        <w:t>فایل Sirman_Setup_1405.5.23ξ.zip را بگیرید.</w:t>
+      </w:r>
+    </w:p>
+    <w:p>
+      <w:pPr>
+        <w:pStyle w:val="ListNumber"/>
+        <w:bidi w:val="1"/>
+        <w:jc w:val="right"/>
+      </w:pPr>
+      <w:r>
+        <w:rPr>
+          <w:rFonts w:ascii="Tahoma" w:hAnsi="Tahoma"/>
+          <w:sz w:val="24"/>
+          <w:rtl w:val="1"/>
+        </w:rPr>
+        <w:t>روی zip راست‌کلیک → Extract All.</w:t>
+      </w:r>
+    </w:p>
+    <w:p>
+      <w:pPr>
+        <w:pStyle w:val="ListNumber"/>
+        <w:bidi w:val="1"/>
+        <w:jc w:val="right"/>
+      </w:pPr>
+      <w:r>
+        <w:rPr>
+          <w:rFonts w:ascii="Tahoma" w:hAnsi="Tahoma"/>
+          <w:sz w:val="24"/>
+          <w:rtl w:val="1"/>
+        </w:rPr>
+        <w:t>فقط روی نصب.bat یا SETUP.bat دوبار کلیک کنید.</w:t>
+      </w:r>
+    </w:p>
+    <w:p>
+      <w:pPr>
+        <w:pStyle w:val="ListNumber"/>
+        <w:bidi w:val="1"/>
+        <w:jc w:val="right"/>
+      </w:pPr>
+      <w:r>
+        <w:rPr>
+          <w:rFonts w:ascii="Tahoma" w:hAnsi="Tahoma"/>
+          <w:sz w:val="24"/>
+          <w:rtl w:val="1"/>
+        </w:rPr>
+        <w:t>پوشه نصب را انتخاب کنید (پیشنهاد: Documents\Sirman).</w:t>
+      </w:r>
+    </w:p>
+    <w:p>
+      <w:pPr>
+        <w:pStyle w:val="ListNumber"/>
+        <w:bidi w:val="1"/>
+        <w:jc w:val="right"/>
+      </w:pPr>
+      <w:r>
+        <w:rPr>
+          <w:rFonts w:ascii="Tahoma" w:hAnsi="Tahoma"/>
+          <w:sz w:val="24"/>
+          <w:rtl w:val="1"/>
+        </w:rPr>
+        <w:t>میانبر دسکتاپ را تأیید کنید.</w:t>
+      </w:r>
+    </w:p>
+    <w:p>
+      <w:pPr>
+        <w:pStyle w:val="ListNumber"/>
+        <w:bidi w:val="1"/>
+        <w:jc w:val="right"/>
+      </w:pPr>
+      <w:r>
+        <w:rPr>
+          <w:rFonts w:ascii="Tahoma" w:hAnsi="Tahoma"/>
+          <w:sz w:val="24"/>
+          <w:rtl w:val="1"/>
+        </w:rPr>
+        <w:t>از منوی Start برنامه Sirman را باز کنید. نسخه پایین سایدبار باید ۱۴۰۵.۵.۲۳ξ باشد.</w:t>
       </w:r>
     </w:p>
     <w:p>
@@ -107,94 +162,12 @@
       </w:pPr>
       <w:r>
         <w:rPr>
-          <w:rFonts w:ascii="Tahoma" w:hAnsi="Tahoma" w:cs="Tahoma" w:eastAsia="Tahoma"/>
-          <w:b/>
-          <w:color w:val="B45309"/>
-          <w:sz w:val="24"/>
-          <w:rtl w:val="1"/>
-          <w:cs/>
-        </w:rPr>
-        <w:t>اگر فایلی دیدید شبیه Sirman_Update_….json که حجمش حدود ۱ کیلوبایت است، آن فایل برنامه نیست.</w:t>
-      </w:r>
-    </w:p>
-    <w:p>
-      <w:pPr>
-        <w:bidi w:val="1"/>
-        <w:jc w:val="right"/>
-      </w:pPr>
-      <w:r>
-        <w:rPr>
-          <w:rFonts w:ascii="Tahoma" w:hAnsi="Tahoma" w:cs="Tahoma" w:eastAsia="Tahoma"/>
-          <w:b w:val="0"/>
-          <w:sz w:val="24"/>
-          <w:rtl w:val="1"/>
-          <w:cs/>
-        </w:rPr>
-        <w:t>با باز کردن یا بارگذاری آن فایل، نرم‌افزار نصب نمی‌شود. آن فایل حداکثر شماره نسخه را عوض می‌کند.</w:t>
-      </w:r>
-    </w:p>
-    <w:p>
-      <w:pPr>
-        <w:bidi w:val="1"/>
-        <w:jc w:val="right"/>
-      </w:pPr>
-      <w:r>
-        <w:rPr>
-          <w:rFonts w:ascii="Tahoma" w:hAnsi="Tahoma" w:cs="Tahoma" w:eastAsia="Tahoma"/>
+          <w:rFonts w:ascii="Tahoma" w:hAnsi="Tahoma"/>
           <w:b/>
           <w:sz w:val="24"/>
           <w:rtl w:val="1"/>
-          <w:cs/>
         </w:rPr>
-        <w:t>برنامه واقعی این‌هاست:</w:t>
-      </w:r>
-    </w:p>
-    <w:p>
-      <w:pPr>
-        <w:pStyle w:val="ListBullet"/>
-        <w:bidi w:val="1"/>
-        <w:jc w:val="right"/>
-      </w:pPr>
-      <w:r>
-        <w:rPr>
-          <w:rFonts w:ascii="Tahoma" w:hAnsi="Tahoma" w:cs="Tahoma" w:eastAsia="Tahoma"/>
-          <w:sz w:val="24"/>
-          <w:rtl w:val="1"/>
-          <w:cs/>
-        </w:rPr>
-        <w:t>Sirman_Final.html — خود نرم‌افزار. حجم حدود ۱٫۶ مگابایت. اگر چند کیلوبایت بود، فایل اشتباه است.</w:t>
-      </w:r>
-    </w:p>
-    <w:p>
-      <w:pPr>
-        <w:pStyle w:val="ListBullet"/>
-        <w:bidi w:val="1"/>
-        <w:jc w:val="right"/>
-      </w:pPr>
-      <w:r>
-        <w:rPr>
-          <w:rFonts w:ascii="Tahoma" w:hAnsi="Tahoma" w:cs="Tahoma" w:eastAsia="Tahoma"/>
-          <w:sz w:val="24"/>
-          <w:rtl w:val="1"/>
-          <w:cs/>
-        </w:rPr>
-        <w:t>Sirman.exe — پنجره ویندوز (اختیاری). معمولاً آماده در گیت‌هاب نیست؛ باید با build-win.bat ساخته شود.</w:t>
-      </w:r>
-    </w:p>
-    <w:p>
-      <w:pPr>
-        <w:bidi w:val="1"/>
-        <w:jc w:val="right"/>
-      </w:pPr>
-      <w:r>
-        <w:rPr>
-          <w:rFonts w:ascii="Tahoma" w:hAnsi="Tahoma" w:cs="Tahoma" w:eastAsia="Tahoma"/>
-          <w:b/>
-          <w:sz w:val="24"/>
-          <w:rtl w:val="1"/>
-          <w:cs/>
-        </w:rPr>
-        <w:t>اگر فقط JSON یک‌کیلوبایتی را کپی کردید، هیچ برنامه‌ای آپدیت نشده است.</w:t>
+        <w:t>اگر قبلاً نصب داشتید همان کیت را بزنید و همان پوشه قبلی را انتخاب کنید. قبلش بک‌آپ بگیرید.</w:t>
       </w:r>
     </w:p>
     <w:p>
@@ -205,13 +178,12 @@
       </w:pPr>
       <w:r>
         <w:rPr>
-          <w:rFonts w:ascii="Tahoma" w:hAnsi="Tahoma" w:cs="Tahoma" w:eastAsia="Tahoma"/>
+          <w:rFonts w:ascii="Tahoma" w:hAnsi="Tahoma"/>
           <w:b/>
           <w:sz w:val="24"/>
           <w:rtl w:val="1"/>
-          <w:cs/>
         </w:rPr>
-        <w:t>۲) چه چیزی باید داشته باشید</w:t>
+        <w:t>۲) فایل یک‌کیلوبایتی برنامه نیست</w:t>
       </w:r>
     </w:p>
     <w:p>
@@ -221,157 +193,12 @@
       </w:pPr>
       <w:r>
         <w:rPr>
-          <w:rFonts w:ascii="Tahoma" w:hAnsi="Tahoma" w:cs="Tahoma" w:eastAsia="Tahoma"/>
+          <w:rFonts w:ascii="Tahoma" w:hAnsi="Tahoma"/>
           <w:b w:val="0"/>
           <w:sz w:val="24"/>
           <w:rtl w:val="1"/>
-          <w:cs/>
         </w:rPr>
-        <w:t>کل پوشه برنامه را بگیرید، نه یک فایل تکی.</w:t>
-      </w:r>
-    </w:p>
-    <w:p>
-      <w:pPr>
-        <w:bidi w:val="1"/>
-        <w:jc w:val="right"/>
-      </w:pPr>
-      <w:r>
-        <w:rPr>
-          <w:rFonts w:ascii="Tahoma" w:hAnsi="Tahoma" w:cs="Tahoma" w:eastAsia="Tahoma"/>
-          <w:b/>
-          <w:sz w:val="24"/>
-          <w:rtl w:val="1"/>
-          <w:cs/>
-        </w:rPr>
-        <w:t>حداقل برای روش ساده:</w:t>
-      </w:r>
-    </w:p>
-    <w:p>
-      <w:pPr>
-        <w:pStyle w:val="ListBullet"/>
-        <w:bidi w:val="1"/>
-        <w:jc w:val="right"/>
-      </w:pPr>
-      <w:r>
-        <w:rPr>
-          <w:rFonts w:ascii="Tahoma" w:hAnsi="Tahoma" w:cs="Tahoma" w:eastAsia="Tahoma"/>
-          <w:sz w:val="24"/>
-          <w:rtl w:val="1"/>
-          <w:cs/>
-        </w:rPr>
-        <w:t>Sirman_Final.html  (حدود ۱٫۶ مگابایت)</w:t>
-      </w:r>
-    </w:p>
-    <w:p>
-      <w:pPr>
-        <w:pStyle w:val="ListBullet"/>
-        <w:bidi w:val="1"/>
-        <w:jc w:val="right"/>
-      </w:pPr>
-      <w:r>
-        <w:rPr>
-          <w:rFonts w:ascii="Tahoma" w:hAnsi="Tahoma" w:cs="Tahoma" w:eastAsia="Tahoma"/>
-          <w:sz w:val="24"/>
-          <w:rtl w:val="1"/>
-          <w:cs/>
-        </w:rPr>
-        <w:t>Sirman_Start.bat</w:t>
-      </w:r>
-    </w:p>
-    <w:p>
-      <w:pPr>
-        <w:pStyle w:val="ListBullet"/>
-        <w:bidi w:val="1"/>
-        <w:jc w:val="right"/>
-      </w:pPr>
-      <w:r>
-        <w:rPr>
-          <w:rFonts w:ascii="Tahoma" w:hAnsi="Tahoma" w:cs="Tahoma" w:eastAsia="Tahoma"/>
-          <w:sz w:val="24"/>
-          <w:rtl w:val="1"/>
-          <w:cs/>
-        </w:rPr>
-        <w:t>نصب_میانبر_سیرمان.bat  (برای آیکون دسکتاپ، اختیاری)</w:t>
-      </w:r>
-    </w:p>
-    <w:p>
-      <w:pPr>
-        <w:bidi w:val="1"/>
-        <w:jc w:val="right"/>
-      </w:pPr>
-      <w:r>
-        <w:rPr>
-          <w:rFonts w:ascii="Tahoma" w:hAnsi="Tahoma" w:cs="Tahoma" w:eastAsia="Tahoma"/>
-          <w:b/>
-          <w:sz w:val="24"/>
-          <w:rtl w:val="1"/>
-          <w:cs/>
-        </w:rPr>
-        <w:t>برای پنجره ویندوز علاوه بر آن:</w:t>
-      </w:r>
-    </w:p>
-    <w:p>
-      <w:pPr>
-        <w:pStyle w:val="ListBullet"/>
-        <w:bidi w:val="1"/>
-        <w:jc w:val="right"/>
-      </w:pPr>
-      <w:r>
-        <w:rPr>
-          <w:rFonts w:ascii="Tahoma" w:hAnsi="Tahoma" w:cs="Tahoma" w:eastAsia="Tahoma"/>
-          <w:sz w:val="24"/>
-          <w:rtl w:val="1"/>
-          <w:cs/>
-        </w:rPr>
-        <w:t>پوشه desktop\Sirman_Windows_Install یا desktop\Sirman_Install_Kit</w:t>
-      </w:r>
-    </w:p>
-    <w:p>
-      <w:pPr>
-        <w:pStyle w:val="ListBullet"/>
-        <w:bidi w:val="1"/>
-        <w:jc w:val="right"/>
-      </w:pPr>
-      <w:r>
-        <w:rPr>
-          <w:rFonts w:ascii="Tahoma" w:hAnsi="Tahoma" w:cs="Tahoma" w:eastAsia="Tahoma"/>
-          <w:sz w:val="24"/>
-          <w:rtl w:val="1"/>
-          <w:cs/>
-        </w:rPr>
-        <w:t>build-win.bat و نصب_سیرمان.bat</w:t>
-      </w:r>
-    </w:p>
-    <w:p>
-      <w:pPr>
-        <w:pStyle w:val="ListBullet"/>
-        <w:bidi w:val="1"/>
-        <w:jc w:val="right"/>
-      </w:pPr>
-      <w:r>
-        <w:rPr>
-          <w:rFonts w:ascii="Tahoma" w:hAnsi="Tahoma" w:cs="Tahoma" w:eastAsia="Tahoma"/>
-          <w:sz w:val="24"/>
-          <w:rtl w:val="1"/>
-          <w:cs/>
-        </w:rPr>
-        <w:t>پوشه Sirman.Desktop (سورس ساخت exe)</w:t>
-      </w:r>
-    </w:p>
-    <w:p>
-      <w:pPr>
-        <w:bidi w:val="1"/>
-        <w:jc w:val="right"/>
-      </w:pPr>
-      <w:r>
-        <w:rPr>
-          <w:rFonts w:ascii="Tahoma" w:hAnsi="Tahoma" w:cs="Tahoma" w:eastAsia="Tahoma"/>
-          <w:b w:val="0"/>
-          <w:sz w:val="24"/>
-          <w:rtl w:val="1"/>
-          <w:cs/>
-        </w:rPr>
-        <w:t>از گیت‌هاب کل مخزن را Download ZIP کنید. فقط فایل داخل پوشه updates را دانلود نکنید.</w:t>
+        <w:t>JSON داخل updates برنامه نیست. برنامه واقعی داخل پوشه App کیت است: Sirman_Final.html حدود ۱٫۶ مگابایت و Sirman.exe.</w:t>
       </w:r>
     </w:p>
     <w:p>
@@ -382,13 +209,12 @@
       </w:pPr>
       <w:r>
         <w:rPr>
-          <w:rFonts w:ascii="Tahoma" w:hAnsi="Tahoma" w:cs="Tahoma" w:eastAsia="Tahoma"/>
+          <w:rFonts w:ascii="Tahoma" w:hAnsi="Tahoma"/>
           <w:b/>
           <w:sz w:val="24"/>
           <w:rtl w:val="1"/>
-          <w:cs/>
         </w:rPr>
-        <w:t>۳) روش ۱ — ساده‌ترین نصب از صفر (شروع سریع)</w:t>
+        <w:t>۳) اگر exe باز نشد</w:t>
       </w:r>
     </w:p>
     <w:p>
@@ -398,194 +224,12 @@
       </w:pPr>
       <w:r>
         <w:rPr>
-          <w:rFonts w:ascii="Tahoma" w:hAnsi="Tahoma" w:cs="Tahoma" w:eastAsia="Tahoma"/>
+          <w:rFonts w:ascii="Tahoma" w:hAnsi="Tahoma"/>
           <w:b w:val="0"/>
           <w:sz w:val="24"/>
           <w:rtl w:val="1"/>
-          <w:cs/>
         </w:rPr>
-        <w:t>این روش مرورگر را باز می‌کند و برای شروع کار فروشگاه کافی است.</w:t>
-      </w:r>
-    </w:p>
-    <w:p>
-      <w:pPr>
-        <w:pStyle w:val="Heading3"/>
-        <w:bidi w:val="1"/>
-        <w:jc w:val="right"/>
-      </w:pPr>
-      <w:r>
-        <w:rPr>
-          <w:rFonts w:ascii="Tahoma" w:hAnsi="Tahoma" w:cs="Tahoma" w:eastAsia="Tahoma"/>
-          <w:b/>
-          <w:sz w:val="24"/>
-          <w:rtl w:val="1"/>
-          <w:cs/>
-        </w:rPr>
-        <w:t>گام ۱</w:t>
-      </w:r>
-    </w:p>
-    <w:p>
-      <w:pPr>
-        <w:bidi w:val="1"/>
-        <w:jc w:val="right"/>
-      </w:pPr>
-      <w:r>
-        <w:rPr>
-          <w:rFonts w:ascii="Tahoma" w:hAnsi="Tahoma" w:cs="Tahoma" w:eastAsia="Tahoma"/>
-          <w:b w:val="0"/>
-          <w:sz w:val="24"/>
-          <w:rtl w:val="1"/>
-          <w:cs/>
-        </w:rPr>
-        <w:t>کل پوشه برنامه را روی کامپیوتر کپی کنید. مثال: Documents\Sirman یا D:\Sirman</w:t>
-      </w:r>
-    </w:p>
-    <w:p>
-      <w:pPr>
-        <w:pStyle w:val="Heading3"/>
-        <w:bidi w:val="1"/>
-        <w:jc w:val="right"/>
-      </w:pPr>
-      <w:r>
-        <w:rPr>
-          <w:rFonts w:ascii="Tahoma" w:hAnsi="Tahoma" w:cs="Tahoma" w:eastAsia="Tahoma"/>
-          <w:b/>
-          <w:sz w:val="24"/>
-          <w:rtl w:val="1"/>
-          <w:cs/>
-        </w:rPr>
-        <w:t>گام ۲</w:t>
-      </w:r>
-    </w:p>
-    <w:p>
-      <w:pPr>
-        <w:bidi w:val="1"/>
-        <w:jc w:val="right"/>
-      </w:pPr>
-      <w:r>
-        <w:rPr>
-          <w:rFonts w:ascii="Tahoma" w:hAnsi="Tahoma" w:cs="Tahoma" w:eastAsia="Tahoma"/>
-          <w:b w:val="0"/>
-          <w:sz w:val="24"/>
-          <w:rtl w:val="1"/>
-          <w:cs/>
-        </w:rPr>
-        <w:t>داخل پوشه روی Sirman_Final.html یا بهتر: Sirman_Start.bat دوبار کلیک کنید.</w:t>
-      </w:r>
-    </w:p>
-    <w:p>
-      <w:pPr>
-        <w:pStyle w:val="Heading3"/>
-        <w:bidi w:val="1"/>
-        <w:jc w:val="right"/>
-      </w:pPr>
-      <w:r>
-        <w:rPr>
-          <w:rFonts w:ascii="Tahoma" w:hAnsi="Tahoma" w:cs="Tahoma" w:eastAsia="Tahoma"/>
-          <w:b/>
-          <w:sz w:val="24"/>
-          <w:rtl w:val="1"/>
-          <w:cs/>
-        </w:rPr>
-        <w:t>گام ۳</w:t>
-      </w:r>
-    </w:p>
-    <w:p>
-      <w:pPr>
-        <w:bidi w:val="1"/>
-        <w:jc w:val="right"/>
-      </w:pPr>
-      <w:r>
-        <w:rPr>
-          <w:rFonts w:ascii="Tahoma" w:hAnsi="Tahoma" w:cs="Tahoma" w:eastAsia="Tahoma"/>
-          <w:b w:val="0"/>
-          <w:sz w:val="24"/>
-          <w:rtl w:val="1"/>
-          <w:cs/>
-        </w:rPr>
-        <w:t>برنامه باز می‌شود. اگر اولین بار است، رمز مدیر سیستم را بگذارید و به خاطر بسپارید.</w:t>
-      </w:r>
-    </w:p>
-    <w:p>
-      <w:pPr>
-        <w:pStyle w:val="Heading3"/>
-        <w:bidi w:val="1"/>
-        <w:jc w:val="right"/>
-      </w:pPr>
-      <w:r>
-        <w:rPr>
-          <w:rFonts w:ascii="Tahoma" w:hAnsi="Tahoma" w:cs="Tahoma" w:eastAsia="Tahoma"/>
-          <w:b/>
-          <w:sz w:val="24"/>
-          <w:rtl w:val="1"/>
-          <w:cs/>
-        </w:rPr>
-        <w:t>گام ۴ — آیکون دسکتاپ (اختیاری)</w:t>
-      </w:r>
-    </w:p>
-    <w:p>
-      <w:pPr>
-        <w:bidi w:val="1"/>
-        <w:jc w:val="right"/>
-      </w:pPr>
-      <w:r>
-        <w:rPr>
-          <w:rFonts w:ascii="Tahoma" w:hAnsi="Tahoma" w:cs="Tahoma" w:eastAsia="Tahoma"/>
-          <w:b w:val="0"/>
-          <w:sz w:val="24"/>
-          <w:rtl w:val="1"/>
-          <w:cs/>
-        </w:rPr>
-        <w:t>یک‌بار نصب_میانبر_سیرمان.bat را اجرا کنید و گزینه ۲ را بزنید.</w:t>
-      </w:r>
-    </w:p>
-    <w:p>
-      <w:pPr>
-        <w:pStyle w:val="Heading3"/>
-        <w:bidi w:val="1"/>
-        <w:jc w:val="right"/>
-      </w:pPr>
-      <w:r>
-        <w:rPr>
-          <w:rFonts w:ascii="Tahoma" w:hAnsi="Tahoma" w:cs="Tahoma" w:eastAsia="Tahoma"/>
-          <w:b/>
-          <w:sz w:val="24"/>
-          <w:rtl w:val="1"/>
-          <w:cs/>
-        </w:rPr>
-        <w:t>گام ۵</w:t>
-      </w:r>
-    </w:p>
-    <w:p>
-      <w:pPr>
-        <w:bidi w:val="1"/>
-        <w:jc w:val="right"/>
-      </w:pPr>
-      <w:r>
-        <w:rPr>
-          <w:rFonts w:ascii="Tahoma" w:hAnsi="Tahoma" w:cs="Tahoma" w:eastAsia="Tahoma"/>
-          <w:b w:val="0"/>
-          <w:sz w:val="24"/>
-          <w:rtl w:val="1"/>
-          <w:cs/>
-        </w:rPr>
-        <w:t>پایین منوی راست نسخه را ببینید. باید ۱۴۰۵.۵.۲۳ν باشد. تمام. برنامه نصب شد.</w:t>
-      </w:r>
-    </w:p>
-    <w:p>
-      <w:pPr>
-        <w:bidi w:val="1"/>
-        <w:jc w:val="right"/>
-      </w:pPr>
-      <w:r>
-        <w:rPr>
-          <w:rFonts w:ascii="Tahoma" w:hAnsi="Tahoma" w:cs="Tahoma" w:eastAsia="Tahoma"/>
-          <w:b w:val="0"/>
-          <w:sz w:val="24"/>
-          <w:rtl w:val="1"/>
-          <w:cs/>
-        </w:rPr>
-        <w:t>اگر با Sirman_Start.bat باز کردید پنجره مشکی را نبندید. آدرس معمولاً http://127.0.0.1:8765/Sirman_Final.html است.</w:t>
+        <w:t>Desktop Runtime 8 ویندوز لازم است. وگرنه از پوشه نصب Sirman_Start.bat را بزنید. WebView2 معمولاً با Edge هست.</w:t>
       </w:r>
     </w:p>
     <w:p>
@@ -596,13 +240,12 @@
       </w:pPr>
       <w:r>
         <w:rPr>
-          <w:rFonts w:ascii="Tahoma" w:hAnsi="Tahoma" w:cs="Tahoma" w:eastAsia="Tahoma"/>
+          <w:rFonts w:ascii="Tahoma" w:hAnsi="Tahoma"/>
           <w:b/>
           <w:sz w:val="24"/>
           <w:rtl w:val="1"/>
-          <w:cs/>
         </w:rPr>
-        <w:t>۴) روش ۲ — نصب با پنجره ویندوز (Sirman.exe)</w:t>
+        <w:t>۴) داده</w:t>
       </w:r>
     </w:p>
     <w:p>
@@ -612,731 +255,17 @@
       </w:pPr>
       <w:r>
         <w:rPr>
-          <w:rFonts w:ascii="Tahoma" w:hAnsi="Tahoma" w:cs="Tahoma" w:eastAsia="Tahoma"/>
+          <w:rFonts w:ascii="Tahoma" w:hAnsi="Tahoma"/>
           <w:b w:val="0"/>
           <w:sz w:val="24"/>
           <w:rtl w:val="1"/>
-          <w:cs/>
         </w:rPr>
-        <w:t>وقتی می‌خواهید برنامه در پنجره خودش باز شود. هسته حساب این نسخه داخل exe است؛ برای آن مسیر exe جدید لازم است.</w:t>
-      </w:r>
-    </w:p>
-    <w:p>
-      <w:pPr>
-        <w:pStyle w:val="Heading3"/>
-        <w:bidi w:val="1"/>
-        <w:jc w:val="right"/>
-      </w:pPr>
-      <w:r>
-        <w:rPr>
-          <w:rFonts w:ascii="Tahoma" w:hAnsi="Tahoma" w:cs="Tahoma" w:eastAsia="Tahoma"/>
-          <w:b/>
-          <w:sz w:val="24"/>
-          <w:rtl w:val="1"/>
-          <w:cs/>
-        </w:rPr>
-        <w:t>پیش‌نیاز (فقط برای ساخت exe)</w:t>
-      </w:r>
-    </w:p>
-    <w:p>
-      <w:pPr>
-        <w:pStyle w:val="ListBullet"/>
-        <w:bidi w:val="1"/>
-        <w:jc w:val="right"/>
-      </w:pPr>
-      <w:r>
-        <w:rPr>
-          <w:rFonts w:ascii="Tahoma" w:hAnsi="Tahoma" w:cs="Tahoma" w:eastAsia="Tahoma"/>
-          <w:sz w:val="24"/>
-          <w:rtl w:val="1"/>
-          <w:cs/>
-        </w:rPr>
-        <w:t>.NET 8 SDK از https://dotnet.microsoft.com/download/dotnet/8.0</w:t>
-      </w:r>
-    </w:p>
-    <w:p>
-      <w:pPr>
-        <w:pStyle w:val="ListBullet"/>
-        <w:bidi w:val="1"/>
-        <w:jc w:val="right"/>
-      </w:pPr>
-      <w:r>
-        <w:rPr>
-          <w:rFonts w:ascii="Tahoma" w:hAnsi="Tahoma" w:cs="Tahoma" w:eastAsia="Tahoma"/>
-          <w:sz w:val="24"/>
-          <w:rtl w:val="1"/>
-          <w:cs/>
-        </w:rPr>
-        <w:t>WebView2 Runtime — معمولاً با Edge هست. اگر نبود از سایت مایکروسافت نصب کنید.</w:t>
-      </w:r>
-    </w:p>
-    <w:p>
-      <w:pPr>
-        <w:pStyle w:val="Heading3"/>
-        <w:bidi w:val="1"/>
-        <w:jc w:val="right"/>
-      </w:pPr>
-      <w:r>
-        <w:rPr>
-          <w:rFonts w:ascii="Tahoma" w:hAnsi="Tahoma" w:cs="Tahoma" w:eastAsia="Tahoma"/>
-          <w:b/>
-          <w:sz w:val="24"/>
-          <w:rtl w:val="1"/>
-          <w:cs/>
-        </w:rPr>
-        <w:t>گام‌ها</w:t>
-      </w:r>
-    </w:p>
-    <w:p>
-      <w:pPr>
-        <w:pStyle w:val="ListBullet"/>
-        <w:bidi w:val="1"/>
-        <w:jc w:val="right"/>
-      </w:pPr>
-      <w:r>
-        <w:rPr>
-          <w:rFonts w:ascii="Tahoma" w:hAnsi="Tahoma" w:cs="Tahoma" w:eastAsia="Tahoma"/>
-          <w:sz w:val="24"/>
-          <w:rtl w:val="1"/>
-          <w:cs/>
-        </w:rPr>
-        <w:t>پوشه desktop\Sirman_Windows_Install را کامل روی ویندوز کپی کنید.</w:t>
-      </w:r>
-    </w:p>
-    <w:p>
-      <w:pPr>
-        <w:pStyle w:val="ListBullet"/>
-        <w:bidi w:val="1"/>
-        <w:jc w:val="right"/>
-      </w:pPr>
-      <w:r>
-        <w:rPr>
-          <w:rFonts w:ascii="Tahoma" w:hAnsi="Tahoma" w:cs="Tahoma" w:eastAsia="Tahoma"/>
-          <w:sz w:val="24"/>
-          <w:rtl w:val="1"/>
-          <w:cs/>
-        </w:rPr>
-        <w:t>روی build-win.bat دوبار کلیک کنید تا پوشه publish و Sirman.exe ساخته شود. اگر گفت dotnet پیدا نشد، SDK نصب نیست.</w:t>
-      </w:r>
-    </w:p>
-    <w:p>
-      <w:pPr>
-        <w:pStyle w:val="ListBullet"/>
-        <w:bidi w:val="1"/>
-        <w:jc w:val="right"/>
-      </w:pPr>
-      <w:r>
-        <w:rPr>
-          <w:rFonts w:ascii="Tahoma" w:hAnsi="Tahoma" w:cs="Tahoma" w:eastAsia="Tahoma"/>
-          <w:sz w:val="24"/>
-          <w:rtl w:val="1"/>
-          <w:cs/>
-        </w:rPr>
-        <w:t>روی نصب_سیرمان.bat دوبار کلیک کنید، پوشه نصب را انتخاب کنید (مثلاً Documents\Sirman)، در صورت تمایل میانبر دسکتاپ بسازید.</w:t>
-      </w:r>
-    </w:p>
-    <w:p>
-      <w:pPr>
-        <w:pStyle w:val="ListBullet"/>
-        <w:bidi w:val="1"/>
-        <w:jc w:val="right"/>
-      </w:pPr>
-      <w:r>
-        <w:rPr>
-          <w:rFonts w:ascii="Tahoma" w:hAnsi="Tahoma" w:cs="Tahoma" w:eastAsia="Tahoma"/>
-          <w:sz w:val="24"/>
-          <w:rtl w:val="1"/>
-          <w:cs/>
-        </w:rPr>
-        <w:t>از منوی Start «سیرمان» را باز کنید.</w:t>
-      </w:r>
-    </w:p>
-    <w:p>
-      <w:pPr>
-        <w:bidi w:val="1"/>
-        <w:jc w:val="right"/>
-      </w:pPr>
-      <w:r>
-        <w:rPr>
-          <w:rFonts w:ascii="Tahoma" w:hAnsi="Tahoma" w:cs="Tahoma" w:eastAsia="Tahoma"/>
-          <w:b w:val="0"/>
-          <w:sz w:val="24"/>
-          <w:rtl w:val="1"/>
-          <w:cs/>
-        </w:rPr>
-        <w:t>حذف: منوی Start → حذف سیرمان، یا Uninstall-Sirman.bat کنار exe.</w:t>
-      </w:r>
-    </w:p>
-    <w:p>
-      <w:pPr>
-        <w:pStyle w:val="Heading2"/>
-        <w:bidi w:val="1"/>
-        <w:jc w:val="right"/>
-      </w:pPr>
-      <w:r>
-        <w:rPr>
-          <w:rFonts w:ascii="Tahoma" w:hAnsi="Tahoma" w:cs="Tahoma" w:eastAsia="Tahoma"/>
-          <w:b/>
-          <w:sz w:val="24"/>
-          <w:rtl w:val="1"/>
-          <w:cs/>
-        </w:rPr>
-        <w:t>۵) روش ۳ — اگر Sirman.exe آماده به شما دادند</w:t>
-      </w:r>
-    </w:p>
-    <w:p>
-      <w:pPr>
-        <w:pStyle w:val="ListBullet"/>
-        <w:bidi w:val="1"/>
-        <w:jc w:val="right"/>
-      </w:pPr>
-      <w:r>
-        <w:rPr>
-          <w:rFonts w:ascii="Tahoma" w:hAnsi="Tahoma" w:cs="Tahoma" w:eastAsia="Tahoma"/>
-          <w:sz w:val="24"/>
-          <w:rtl w:val="1"/>
-          <w:cs/>
-        </w:rPr>
-        <w:t>کل پوشه را کپی کنید.</w:t>
-      </w:r>
-    </w:p>
-    <w:p>
-      <w:pPr>
-        <w:pStyle w:val="ListBullet"/>
-        <w:bidi w:val="1"/>
-        <w:jc w:val="right"/>
-      </w:pPr>
-      <w:r>
-        <w:rPr>
-          <w:rFonts w:ascii="Tahoma" w:hAnsi="Tahoma" w:cs="Tahoma" w:eastAsia="Tahoma"/>
-          <w:sz w:val="24"/>
-          <w:rtl w:val="1"/>
-          <w:cs/>
-        </w:rPr>
-        <w:t>باید Sirman.exe و Sirman_Final.html کنار هم باشند.</w:t>
-      </w:r>
-    </w:p>
-    <w:p>
-      <w:pPr>
-        <w:pStyle w:val="ListBullet"/>
-        <w:bidi w:val="1"/>
-        <w:jc w:val="right"/>
-      </w:pPr>
-      <w:r>
-        <w:rPr>
-          <w:rFonts w:ascii="Tahoma" w:hAnsi="Tahoma" w:cs="Tahoma" w:eastAsia="Tahoma"/>
-          <w:sz w:val="24"/>
-          <w:rtl w:val="1"/>
-          <w:cs/>
-        </w:rPr>
-        <w:t>روی Sirman.exe دوبار کلیک کنید.</w:t>
-      </w:r>
-    </w:p>
-    <w:p>
-      <w:pPr>
-        <w:bidi w:val="1"/>
-        <w:jc w:val="right"/>
-      </w:pPr>
-      <w:r>
-        <w:rPr>
-          <w:rFonts w:ascii="Tahoma" w:hAnsi="Tahoma" w:cs="Tahoma" w:eastAsia="Tahoma"/>
-          <w:b w:val="0"/>
-          <w:sz w:val="24"/>
-          <w:rtl w:val="1"/>
-          <w:cs/>
-        </w:rPr>
-        <w:t>بدون HTML کنار exe، پنجره خالی یا خطا می‌دهد.</w:t>
-      </w:r>
-    </w:p>
-    <w:p>
-      <w:pPr>
-        <w:pStyle w:val="Heading2"/>
-        <w:bidi w:val="1"/>
-        <w:jc w:val="right"/>
-      </w:pPr>
-      <w:r>
-        <w:rPr>
-          <w:rFonts w:ascii="Tahoma" w:hAnsi="Tahoma" w:cs="Tahoma" w:eastAsia="Tahoma"/>
-          <w:b/>
-          <w:sz w:val="24"/>
-          <w:rtl w:val="1"/>
-          <w:cs/>
-        </w:rPr>
-        <w:t>۶) بعد از نصب — اولین کارها و جای داده</w:t>
-      </w:r>
-    </w:p>
-    <w:p>
-      <w:pPr>
-        <w:pStyle w:val="ListBullet"/>
-        <w:bidi w:val="1"/>
-        <w:jc w:val="right"/>
-      </w:pPr>
-      <w:r>
-        <w:rPr>
-          <w:rFonts w:ascii="Tahoma" w:hAnsi="Tahoma" w:cs="Tahoma" w:eastAsia="Tahoma"/>
-          <w:sz w:val="24"/>
-          <w:rtl w:val="1"/>
-          <w:cs/>
-        </w:rPr>
-        <w:t>نسخه پایین سایدبار را چک کنید: ۱۴۰۵.۵.۲۳ν</w:t>
-      </w:r>
-    </w:p>
-    <w:p>
-      <w:pPr>
-        <w:pStyle w:val="ListBullet"/>
-        <w:bidi w:val="1"/>
-        <w:jc w:val="right"/>
-      </w:pPr>
-      <w:r>
-        <w:rPr>
-          <w:rFonts w:ascii="Tahoma" w:hAnsi="Tahoma" w:cs="Tahoma" w:eastAsia="Tahoma"/>
-          <w:sz w:val="24"/>
-          <w:rtl w:val="1"/>
-          <w:cs/>
-        </w:rPr>
-        <w:t>از «ورود/خروج داده» یک بک‌آپ بگیرید و جایی امن بگذارید.</w:t>
-      </w:r>
-    </w:p>
-    <w:p>
-      <w:pPr>
-        <w:pStyle w:val="ListBullet"/>
-        <w:bidi w:val="1"/>
-        <w:jc w:val="right"/>
-      </w:pPr>
-      <w:r>
-        <w:rPr>
-          <w:rFonts w:ascii="Tahoma" w:hAnsi="Tahoma" w:cs="Tahoma" w:eastAsia="Tahoma"/>
-          <w:sz w:val="24"/>
-          <w:rtl w:val="1"/>
-          <w:cs/>
-        </w:rPr>
-        <w:t>بعد کالا، قطعه و حساب را تعریف کنید؛ سپس فاکتور و گارانتی.</w:t>
-      </w:r>
-    </w:p>
-    <w:p>
-      <w:pPr>
-        <w:bidi w:val="1"/>
-        <w:jc w:val="right"/>
-      </w:pPr>
-      <w:r>
-        <w:rPr>
-          <w:rFonts w:ascii="Tahoma" w:hAnsi="Tahoma" w:cs="Tahoma" w:eastAsia="Tahoma"/>
-          <w:b/>
-          <w:sz w:val="24"/>
-          <w:rtl w:val="1"/>
-          <w:cs/>
-        </w:rPr>
-        <w:t>فاکتور و گارانتی داخل فایل HTML نیست. در حافظه همین مرورگر یا همین exe روی همین کامپیوتر است.</w:t>
-      </w:r>
-    </w:p>
-    <w:p>
-      <w:pPr>
-        <w:pStyle w:val="ListBullet"/>
-        <w:bidi w:val="1"/>
-        <w:jc w:val="right"/>
-      </w:pPr>
-      <w:r>
-        <w:rPr>
-          <w:rFonts w:ascii="Tahoma" w:hAnsi="Tahoma" w:cs="Tahoma" w:eastAsia="Tahoma"/>
-          <w:sz w:val="24"/>
-          <w:rtl w:val="1"/>
-          <w:cs/>
-        </w:rPr>
-        <w:t>اگر فقط فایل را به کامپیوتر دیگر ببرید، آنجا برنامه خالی باز می‌شود.</w:t>
-      </w:r>
-    </w:p>
-    <w:p>
-      <w:pPr>
-        <w:pStyle w:val="ListBullet"/>
-        <w:bidi w:val="1"/>
-        <w:jc w:val="right"/>
-      </w:pPr>
-      <w:r>
-        <w:rPr>
-          <w:rFonts w:ascii="Tahoma" w:hAnsi="Tahoma" w:cs="Tahoma" w:eastAsia="Tahoma"/>
-          <w:sz w:val="24"/>
-          <w:rtl w:val="1"/>
-          <w:cs/>
-        </w:rPr>
-        <w:t>قبل از جابه‌جایی از «ورود/خروج داده» بک‌آپ بگیرید.</w:t>
-      </w:r>
-    </w:p>
-    <w:p>
-      <w:pPr>
-        <w:pStyle w:val="ListBullet"/>
-        <w:bidi w:val="1"/>
-        <w:jc w:val="right"/>
-      </w:pPr>
-      <w:r>
-        <w:rPr>
-          <w:rFonts w:ascii="Tahoma" w:hAnsi="Tahoma" w:cs="Tahoma" w:eastAsia="Tahoma"/>
-          <w:sz w:val="24"/>
-          <w:rtl w:val="1"/>
-          <w:cs/>
-        </w:rPr>
-        <w:t>روی کامپیوتر جدید همان بک‌آپ را با حالت جایگزینی برگردانید.</w:t>
-      </w:r>
-    </w:p>
-    <w:p>
-      <w:pPr>
-        <w:pStyle w:val="Heading2"/>
-        <w:bidi w:val="1"/>
-        <w:jc w:val="right"/>
-      </w:pPr>
-      <w:r>
-        <w:rPr>
-          <w:rFonts w:ascii="Tahoma" w:hAnsi="Tahoma" w:cs="Tahoma" w:eastAsia="Tahoma"/>
-          <w:b/>
-          <w:sz w:val="24"/>
-          <w:rtl w:val="1"/>
-          <w:cs/>
-        </w:rPr>
-        <w:t>۷) اگر قبلاً برنامه را دارید (آپدیت، نه نصب اول)</w:t>
-      </w:r>
-    </w:p>
-    <w:p>
-      <w:pPr>
-        <w:pStyle w:val="ListBullet"/>
-        <w:bidi w:val="1"/>
-        <w:jc w:val="right"/>
-      </w:pPr>
-      <w:r>
-        <w:rPr>
-          <w:rFonts w:ascii="Tahoma" w:hAnsi="Tahoma" w:cs="Tahoma" w:eastAsia="Tahoma"/>
-          <w:sz w:val="24"/>
-          <w:rtl w:val="1"/>
-          <w:cs/>
-        </w:rPr>
-        <w:t>از «ورود/خروج داده» بک‌آپ کامل بگیرید.</w:t>
-      </w:r>
-    </w:p>
-    <w:p>
-      <w:pPr>
-        <w:pStyle w:val="ListBullet"/>
-        <w:bidi w:val="1"/>
-        <w:jc w:val="right"/>
-      </w:pPr>
-      <w:r>
-        <w:rPr>
-          <w:rFonts w:ascii="Tahoma" w:hAnsi="Tahoma" w:cs="Tahoma" w:eastAsia="Tahoma"/>
-          <w:sz w:val="24"/>
-          <w:rtl w:val="1"/>
-          <w:cs/>
-        </w:rPr>
-        <w:t>Sirman_Final.html جدید را جایگزین کنید (حدود ۱٫۶ مگابایت، نه ۱ کیلوبایت).</w:t>
-      </w:r>
-    </w:p>
-    <w:p>
-      <w:pPr>
-        <w:pStyle w:val="ListBullet"/>
-        <w:bidi w:val="1"/>
-        <w:jc w:val="right"/>
-      </w:pPr>
-      <w:r>
-        <w:rPr>
-          <w:rFonts w:ascii="Tahoma" w:hAnsi="Tahoma" w:cs="Tahoma" w:eastAsia="Tahoma"/>
-          <w:sz w:val="24"/>
-          <w:rtl w:val="1"/>
-          <w:cs/>
-        </w:rPr>
-        <w:t>اگر با exe کار می‌کنید: HTML به‌تنهایی کافی نیست. exe جدید هم لازم است (دوباره build-win.bat). هسته حساب داخل پوسته است.</w:t>
-      </w:r>
-    </w:p>
-    <w:p>
-      <w:pPr>
-        <w:pStyle w:val="ListBullet"/>
-        <w:bidi w:val="1"/>
-        <w:jc w:val="right"/>
-      </w:pPr>
-      <w:r>
-        <w:rPr>
-          <w:rFonts w:ascii="Tahoma" w:hAnsi="Tahoma" w:cs="Tahoma" w:eastAsia="Tahoma"/>
-          <w:sz w:val="24"/>
-          <w:rtl w:val="1"/>
-          <w:cs/>
-        </w:rPr>
-        <w:t>لانچر Sirman_Start.bat را هم اگر همراه بسته آمده جایگزین کنید.</w:t>
-      </w:r>
-    </w:p>
-    <w:p>
-      <w:pPr>
-        <w:pStyle w:val="ListBullet"/>
-        <w:bidi w:val="1"/>
-        <w:jc w:val="right"/>
-      </w:pPr>
-      <w:r>
-        <w:rPr>
-          <w:rFonts w:ascii="Tahoma" w:hAnsi="Tahoma" w:cs="Tahoma" w:eastAsia="Tahoma"/>
-          <w:sz w:val="24"/>
-          <w:rtl w:val="1"/>
-          <w:cs/>
-        </w:rPr>
-        <w:t>برنامه را باز کنید. نسخه باید ۱۴۰۵.۵.۲۳ν باشد و فاکتور قبلی سر جایش.</w:t>
-      </w:r>
-    </w:p>
-    <w:p>
-      <w:pPr>
-        <w:bidi w:val="1"/>
-        <w:jc w:val="right"/>
-      </w:pPr>
-      <w:r>
-        <w:rPr>
-          <w:rFonts w:ascii="Tahoma" w:hAnsi="Tahoma" w:cs="Tahoma" w:eastAsia="Tahoma"/>
-          <w:b/>
-          <w:color w:val="B45309"/>
-          <w:sz w:val="24"/>
-          <w:rtl w:val="1"/>
-          <w:cs/>
-        </w:rPr>
-        <w:t>فایل JSON یک‌کیلوبایتی را به‌جای برنامه بارگذاری نکنید. برای این نسخه کافی نیست.</w:t>
-      </w:r>
-    </w:p>
-    <w:p>
-      <w:pPr>
-        <w:pStyle w:val="Heading2"/>
-        <w:bidi w:val="1"/>
-        <w:jc w:val="right"/>
-      </w:pPr>
-      <w:r>
-        <w:rPr>
-          <w:rFonts w:ascii="Tahoma" w:hAnsi="Tahoma" w:cs="Tahoma" w:eastAsia="Tahoma"/>
-          <w:b/>
-          <w:sz w:val="24"/>
-          <w:rtl w:val="1"/>
-          <w:cs/>
-        </w:rPr>
-        <w:t>۸) فایل JSON آپدیت چیست؟</w:t>
-      </w:r>
-    </w:p>
-    <w:p>
-      <w:pPr>
-        <w:bidi w:val="1"/>
-        <w:jc w:val="right"/>
-      </w:pPr>
-      <w:r>
-        <w:rPr>
-          <w:rFonts w:ascii="Tahoma" w:hAnsi="Tahoma" w:cs="Tahoma" w:eastAsia="Tahoma"/>
-          <w:b w:val="0"/>
-          <w:sz w:val="24"/>
-          <w:rtl w:val="1"/>
-          <w:cs/>
-        </w:rPr>
-        <w:t>پوشه updates فقط برای آپدیت خیلی کوچک بعدی است (مثلاً یک رنگ). مسیر: تنظیمات → تب آپدیت → بارگذاری فایل آپدیت. یا نام فایل را Sirman_Pending_Update.json بگذارید کنار Sirman_Start.bat.</w:t>
-      </w:r>
-    </w:p>
-    <w:p>
-      <w:pPr>
-        <w:bidi w:val="1"/>
-        <w:jc w:val="right"/>
-      </w:pPr>
-      <w:r>
-        <w:rPr>
-          <w:rFonts w:ascii="Tahoma" w:hAnsi="Tahoma" w:cs="Tahoma" w:eastAsia="Tahoma"/>
-          <w:b w:val="0"/>
-          <w:sz w:val="24"/>
-          <w:rtl w:val="1"/>
-          <w:cs/>
-        </w:rPr>
-        <w:t>اگر آپدیت به‌هم ریخت، در همان تب از دانگرید به هسته قبلی برگردید. داده پاک نمی‌شود.</w:t>
-      </w:r>
-    </w:p>
-    <w:p>
-      <w:pPr>
-        <w:pStyle w:val="Heading2"/>
-        <w:bidi w:val="1"/>
-        <w:jc w:val="right"/>
-      </w:pPr>
-      <w:r>
-        <w:rPr>
-          <w:rFonts w:ascii="Tahoma" w:hAnsi="Tahoma" w:cs="Tahoma" w:eastAsia="Tahoma"/>
-          <w:b/>
-          <w:sz w:val="24"/>
-          <w:rtl w:val="1"/>
-          <w:cs/>
-        </w:rPr>
-        <w:t>۹) چک درست نصب شدن</w:t>
-      </w:r>
-    </w:p>
-    <w:p>
-      <w:pPr>
-        <w:pStyle w:val="ListBullet"/>
-        <w:bidi w:val="1"/>
-        <w:jc w:val="right"/>
-      </w:pPr>
-      <w:r>
-        <w:rPr>
-          <w:rFonts w:ascii="Tahoma" w:hAnsi="Tahoma" w:cs="Tahoma" w:eastAsia="Tahoma"/>
-          <w:sz w:val="24"/>
-          <w:rtl w:val="1"/>
-          <w:cs/>
-        </w:rPr>
-        <w:t>حجم Sirman_Final.html حدود ۱٫۶ مگابایت است.</w:t>
-      </w:r>
-    </w:p>
-    <w:p>
-      <w:pPr>
-        <w:pStyle w:val="ListBullet"/>
-        <w:bidi w:val="1"/>
-        <w:jc w:val="right"/>
-      </w:pPr>
-      <w:r>
-        <w:rPr>
-          <w:rFonts w:ascii="Tahoma" w:hAnsi="Tahoma" w:cs="Tahoma" w:eastAsia="Tahoma"/>
-          <w:sz w:val="24"/>
-          <w:rtl w:val="1"/>
-          <w:cs/>
-        </w:rPr>
-        <w:t>برنامه باز می‌شود و قفل نمی‌شود.</w:t>
-      </w:r>
-    </w:p>
-    <w:p>
-      <w:pPr>
-        <w:pStyle w:val="ListBullet"/>
-        <w:bidi w:val="1"/>
-        <w:jc w:val="right"/>
-      </w:pPr>
-      <w:r>
-        <w:rPr>
-          <w:rFonts w:ascii="Tahoma" w:hAnsi="Tahoma" w:cs="Tahoma" w:eastAsia="Tahoma"/>
-          <w:sz w:val="24"/>
-          <w:rtl w:val="1"/>
-          <w:cs/>
-        </w:rPr>
-        <w:t>پایین سایدبار نسخه ۱۴۰۵.۵.۲۳ν است.</w:t>
-      </w:r>
-    </w:p>
-    <w:p>
-      <w:pPr>
-        <w:pStyle w:val="ListBullet"/>
-        <w:bidi w:val="1"/>
-        <w:jc w:val="right"/>
-      </w:pPr>
-      <w:r>
-        <w:rPr>
-          <w:rFonts w:ascii="Tahoma" w:hAnsi="Tahoma" w:cs="Tahoma" w:eastAsia="Tahoma"/>
-          <w:sz w:val="24"/>
-          <w:rtl w:val="1"/>
-          <w:cs/>
-        </w:rPr>
-        <w:t>اگر داده قبلی داشتید، فاکتور و گارانتی هنوز هستند.</w:t>
-      </w:r>
-    </w:p>
-    <w:p>
-      <w:pPr>
-        <w:pStyle w:val="Heading2"/>
-        <w:bidi w:val="1"/>
-        <w:jc w:val="right"/>
-      </w:pPr>
-      <w:r>
-        <w:rPr>
-          <w:rFonts w:ascii="Tahoma" w:hAnsi="Tahoma" w:cs="Tahoma" w:eastAsia="Tahoma"/>
-          <w:b/>
-          <w:sz w:val="24"/>
-          <w:rtl w:val="1"/>
-          <w:cs/>
-        </w:rPr>
-        <w:t>۱۰) اگر باز نشد</w:t>
-      </w:r>
-    </w:p>
-    <w:p>
-      <w:pPr>
-        <w:pStyle w:val="ListBullet"/>
-        <w:bidi w:val="1"/>
-        <w:jc w:val="right"/>
-      </w:pPr>
-      <w:r>
-        <w:rPr>
-          <w:rFonts w:ascii="Tahoma" w:hAnsi="Tahoma" w:cs="Tahoma" w:eastAsia="Tahoma"/>
-          <w:sz w:val="24"/>
-          <w:rtl w:val="1"/>
-          <w:cs/>
-        </w:rPr>
-        <w:t>HTML را با Chrome یا Edge باز کنید. اول از روی فلش روی هارد کپی کنید.</w:t>
-      </w:r>
-    </w:p>
-    <w:p>
-      <w:pPr>
-        <w:pStyle w:val="ListBullet"/>
-        <w:bidi w:val="1"/>
-        <w:jc w:val="right"/>
-      </w:pPr>
-      <w:r>
-        <w:rPr>
-          <w:rFonts w:ascii="Tahoma" w:hAnsi="Tahoma" w:cs="Tahoma" w:eastAsia="Tahoma"/>
-          <w:sz w:val="24"/>
-          <w:rtl w:val="1"/>
-          <w:cs/>
-        </w:rPr>
-        <w:t>اگر BAT گفت HTML نیست: Sirman_Final.html باید کنار همان BAT باشد.</w:t>
-      </w:r>
-    </w:p>
-    <w:p>
-      <w:pPr>
-        <w:pStyle w:val="ListBullet"/>
-        <w:bidi w:val="1"/>
-        <w:jc w:val="right"/>
-      </w:pPr>
-      <w:r>
-        <w:rPr>
-          <w:rFonts w:ascii="Tahoma" w:hAnsi="Tahoma" w:cs="Tahoma" w:eastAsia="Tahoma"/>
-          <w:sz w:val="24"/>
-          <w:rtl w:val="1"/>
-          <w:cs/>
-        </w:rPr>
-        <w:t>اگر build-win کار نکرد: .NET 8 SDK نصب کنید، یک‌بار Restart، دوباره بزنید.</w:t>
-      </w:r>
-    </w:p>
-    <w:p>
-      <w:pPr>
-        <w:pStyle w:val="ListBullet"/>
-        <w:bidi w:val="1"/>
-        <w:jc w:val="right"/>
-      </w:pPr>
-      <w:r>
-        <w:rPr>
-          <w:rFonts w:ascii="Tahoma" w:hAnsi="Tahoma" w:cs="Tahoma" w:eastAsia="Tahoma"/>
-          <w:sz w:val="24"/>
-          <w:rtl w:val="1"/>
-          <w:cs/>
-        </w:rPr>
-        <w:t>اگر exe صفحه سفید داد: HTML را کنار exe بگذارید و WebView2 را نصب کنید.</w:t>
-      </w:r>
-    </w:p>
-    <w:p>
-      <w:pPr>
-        <w:pStyle w:val="ListBullet"/>
-        <w:bidi w:val="1"/>
-        <w:jc w:val="right"/>
-      </w:pPr>
-      <w:r>
-        <w:rPr>
-          <w:rFonts w:ascii="Tahoma" w:hAnsi="Tahoma" w:cs="Tahoma" w:eastAsia="Tahoma"/>
-          <w:sz w:val="24"/>
-          <w:rtl w:val="1"/>
-          <w:cs/>
-        </w:rPr>
-        <w:t>اگر برنامه خالی است: فایل برنامه داده را جابه‌جا نمی‌کند. بک‌آپ را برگردانید.</w:t>
-      </w:r>
-    </w:p>
-    <w:p>
-      <w:pPr>
-        <w:bidi w:val="1"/>
-        <w:jc w:val="right"/>
-      </w:pPr>
-      <w:r>
-        <w:rPr>
-          <w:rFonts w:ascii="Tahoma" w:hAnsi="Tahoma" w:cs="Tahoma" w:eastAsia="Tahoma"/>
-          <w:b w:val="0"/>
-          <w:sz w:val="24"/>
-          <w:rtl w:val="1"/>
-          <w:cs/>
-        </w:rPr>
-        <w:t>داخل برنامه همین متن در راهنما → آپدیت نرم‌افزار → نصب از صفر هم هست.</w:t>
+        <w:t>فاکتور داخل فایل برنامه نیست. برای کامپیوتر جدید بک‌آپ «ورود/خروج داده» را برگردانید.</w:t>
       </w:r>
     </w:p>
     <w:sectPr>
       <w:pgSz w:w="12240" w:h="15840"/>
-      <w:pgMar w:top="907" w:right="1134" w:bottom="907" w:left="1134" w:header="720" w:footer="720" w:gutter="0"/>
+      <w:pgMar w:top="1440" w:right="1134" w:bottom="1440" w:left="1134" w:header="720" w:footer="720" w:gutter="0"/>
       <w:cols w:space="720"/>
       <w:docGrid w:linePitch="360"/>
       <w:bidi w:val="1"/>

</xml_diff>

<commit_message>
Rewrite the shop install guide as a real Word document.
The live deliverable is راهنمای_نصب_و_آپدیت.docx (RTL Tahoma),
not a chat dump or a one-page txt. Steps follow zip → Extract All
→ نصب.bat for version 1405.6.2α.

Co-authored-by: estelami1366-ux <estelami1366-ux@users.noreply.github.com>
</commit_message>
<xml_diff>
--- a/desktop/Sirman_Install_Kit/راهنمای_نصب_و_آپدیت.docx
+++ b/desktop/Sirman_Install_Kit/راهنمای_نصب_و_آپدیت.docx
@@ -10,12 +10,13 @@
       </w:pPr>
       <w:r>
         <w:rPr>
-          <w:rFonts w:ascii="Tahoma" w:hAnsi="Tahoma"/>
+          <w:rFonts w:ascii="Tahoma" w:hAnsi="Tahoma" w:cs="Tahoma" w:eastAsia="Tahoma"/>
           <w:b/>
           <w:sz w:val="24"/>
           <w:rtl w:val="1"/>
+          <w:cs/>
         </w:rPr>
-        <w:t>نصب سیرمان با کیت Setup — بدون کپی‌پیست</w:t>
+        <w:t>راهنمای نصب سیرمان</w:t>
       </w:r>
     </w:p>
     <w:p>
@@ -25,12 +26,13 @@
       </w:pPr>
       <w:r>
         <w:rPr>
-          <w:rFonts w:ascii="Tahoma" w:hAnsi="Tahoma"/>
-          <w:b/>
+          <w:rFonts w:ascii="Tahoma" w:hAnsi="Tahoma" w:cs="Tahoma" w:eastAsia="Tahoma"/>
+          <w:b w:val="0"/>
           <w:sz w:val="24"/>
           <w:rtl w:val="1"/>
+          <w:cs/>
         </w:rPr>
-        <w:t>نسخه ۱۴۰۵.۵.۲۳ξ</w:t>
+        <w:t>لایق الکترونیک پارسیان</w:t>
       </w:r>
     </w:p>
     <w:p>
@@ -40,13 +42,45 @@
       </w:pPr>
       <w:r>
         <w:rPr>
-          <w:rFonts w:ascii="Tahoma" w:hAnsi="Tahoma"/>
+          <w:rFonts w:ascii="Tahoma" w:hAnsi="Tahoma" w:cs="Tahoma" w:eastAsia="Tahoma"/>
           <w:b/>
-          <w:color w:val="B45309"/>
           <w:sz w:val="24"/>
           <w:rtl w:val="1"/>
+          <w:cs/>
         </w:rPr>
-        <w:t>فایل‌ها را یکی‌یکی کپی نکنید.</w:t>
+        <w:t>نسخه نرم‌افزار: ۱۴۰۵.۶.۲α   (1405.6.2α)</w:t>
+      </w:r>
+    </w:p>
+    <w:p>
+      <w:pPr>
+        <w:bidi w:val="1"/>
+        <w:jc w:val="right"/>
+      </w:pPr>
+      <w:r>
+        <w:rPr>
+          <w:rFonts w:ascii="Tahoma" w:hAnsi="Tahoma" w:cs="Tahoma" w:eastAsia="Tahoma"/>
+          <w:b w:val="0"/>
+          <w:sz w:val="24"/>
+          <w:rtl w:val="1"/>
+          <w:cs/>
+        </w:rPr>
+        <w:t>تاریخ: ۱۴۰۵/۰۶/۰۲</w:t>
+      </w:r>
+    </w:p>
+    <w:p>
+      <w:pPr>
+        <w:bidi w:val="1"/>
+        <w:jc w:val="right"/>
+      </w:pPr>
+      <w:r>
+        <w:rPr>
+          <w:rFonts w:ascii="Tahoma" w:hAnsi="Tahoma" w:cs="Tahoma" w:eastAsia="Tahoma"/>
+          <w:b w:val="0"/>
+          <w:sz w:val="24"/>
+          <w:rtl w:val="1"/>
+          <w:cs/>
+        </w:rPr>
+        <w:t>این راهنما برای نصب روی کامپیوتر فروشگاه است. از اول تا آخر پیش بروید.</w:t>
       </w:r>
     </w:p>
     <w:p>
@@ -57,102 +91,13 @@
       </w:pPr>
       <w:r>
         <w:rPr>
-          <w:rFonts w:ascii="Tahoma" w:hAnsi="Tahoma"/>
+          <w:rFonts w:ascii="Tahoma" w:hAnsi="Tahoma" w:cs="Tahoma" w:eastAsia="Tahoma"/>
           <w:b/>
           <w:sz w:val="24"/>
           <w:rtl w:val="1"/>
+          <w:cs/>
         </w:rPr>
-        <w:t>۱) کیت کامل</w:t>
-      </w:r>
-    </w:p>
-    <w:p>
-      <w:pPr>
-        <w:pStyle w:val="ListNumber"/>
-        <w:bidi w:val="1"/>
-        <w:jc w:val="right"/>
-      </w:pPr>
-      <w:r>
-        <w:rPr>
-          <w:rFonts w:ascii="Tahoma" w:hAnsi="Tahoma"/>
-          <w:sz w:val="24"/>
-          <w:rtl w:val="1"/>
-        </w:rPr>
-        <w:t>فایل Sirman_Setup_1405.5.23ξ.zip را بگیرید.</w:t>
-      </w:r>
-    </w:p>
-    <w:p>
-      <w:pPr>
-        <w:pStyle w:val="ListNumber"/>
-        <w:bidi w:val="1"/>
-        <w:jc w:val="right"/>
-      </w:pPr>
-      <w:r>
-        <w:rPr>
-          <w:rFonts w:ascii="Tahoma" w:hAnsi="Tahoma"/>
-          <w:sz w:val="24"/>
-          <w:rtl w:val="1"/>
-        </w:rPr>
-        <w:t>روی zip راست‌کلیک → Extract All.</w:t>
-      </w:r>
-    </w:p>
-    <w:p>
-      <w:pPr>
-        <w:pStyle w:val="ListNumber"/>
-        <w:bidi w:val="1"/>
-        <w:jc w:val="right"/>
-      </w:pPr>
-      <w:r>
-        <w:rPr>
-          <w:rFonts w:ascii="Tahoma" w:hAnsi="Tahoma"/>
-          <w:sz w:val="24"/>
-          <w:rtl w:val="1"/>
-        </w:rPr>
-        <w:t>فقط روی نصب.bat یا SETUP.bat دوبار کلیک کنید.</w:t>
-      </w:r>
-    </w:p>
-    <w:p>
-      <w:pPr>
-        <w:pStyle w:val="ListNumber"/>
-        <w:bidi w:val="1"/>
-        <w:jc w:val="right"/>
-      </w:pPr>
-      <w:r>
-        <w:rPr>
-          <w:rFonts w:ascii="Tahoma" w:hAnsi="Tahoma"/>
-          <w:sz w:val="24"/>
-          <w:rtl w:val="1"/>
-        </w:rPr>
-        <w:t>پوشه نصب را انتخاب کنید (پیشنهاد: Documents\Sirman).</w:t>
-      </w:r>
-    </w:p>
-    <w:p>
-      <w:pPr>
-        <w:pStyle w:val="ListNumber"/>
-        <w:bidi w:val="1"/>
-        <w:jc w:val="right"/>
-      </w:pPr>
-      <w:r>
-        <w:rPr>
-          <w:rFonts w:ascii="Tahoma" w:hAnsi="Tahoma"/>
-          <w:sz w:val="24"/>
-          <w:rtl w:val="1"/>
-        </w:rPr>
-        <w:t>میانبر دسکتاپ را تأیید کنید.</w:t>
-      </w:r>
-    </w:p>
-    <w:p>
-      <w:pPr>
-        <w:pStyle w:val="ListNumber"/>
-        <w:bidi w:val="1"/>
-        <w:jc w:val="right"/>
-      </w:pPr>
-      <w:r>
-        <w:rPr>
-          <w:rFonts w:ascii="Tahoma" w:hAnsi="Tahoma"/>
-          <w:sz w:val="24"/>
-          <w:rtl w:val="1"/>
-        </w:rPr>
-        <w:t>از منوی Start برنامه Sirman را باز کنید. نسخه پایین سایدبار باید ۱۴۰۵.۵.۲۳ξ باشد.</w:t>
+        <w:t>۱) برنامه کدام فایل است؟</w:t>
       </w:r>
     </w:p>
     <w:p>
@@ -162,12 +107,167 @@
       </w:pPr>
       <w:r>
         <w:rPr>
-          <w:rFonts w:ascii="Tahoma" w:hAnsi="Tahoma"/>
+          <w:rFonts w:ascii="Tahoma" w:hAnsi="Tahoma" w:cs="Tahoma" w:eastAsia="Tahoma"/>
           <w:b/>
           <w:sz w:val="24"/>
           <w:rtl w:val="1"/>
+          <w:cs/>
         </w:rPr>
-        <w:t>اگر قبلاً نصب داشتید همان کیت را بزنید و همان پوشه قبلی را انتخاب کنید. قبلش بک‌آپ بگیرید.</w:t>
+        <w:t>فایل نصب فروشگاه:  Sirman_Setup_1405.6.2α.zip</w:t>
+      </w:r>
+    </w:p>
+    <w:p>
+      <w:pPr>
+        <w:bidi w:val="1"/>
+        <w:jc w:val="right"/>
+      </w:pPr>
+      <w:r>
+        <w:rPr>
+          <w:rFonts w:ascii="Tahoma" w:hAnsi="Tahoma" w:cs="Tahoma" w:eastAsia="Tahoma"/>
+          <w:b w:val="0"/>
+          <w:sz w:val="24"/>
+          <w:rtl w:val="1"/>
+          <w:cs/>
+        </w:rPr>
+        <w:t>این یک فایل فشرده است. برنامه داخل آن است.</w:t>
+      </w:r>
+    </w:p>
+    <w:p>
+      <w:pPr>
+        <w:bidi w:val="1"/>
+        <w:jc w:val="right"/>
+      </w:pPr>
+      <w:r>
+        <w:rPr>
+          <w:rFonts w:ascii="Tahoma" w:hAnsi="Tahoma" w:cs="Tahoma" w:eastAsia="Tahoma"/>
+          <w:b/>
+          <w:color w:val="B45309"/>
+          <w:sz w:val="24"/>
+          <w:rtl w:val="1"/>
+          <w:cs/>
+        </w:rPr>
+        <w:t>این‌ها برنامه نیستند:</w:t>
+      </w:r>
+    </w:p>
+    <w:p>
+      <w:pPr>
+        <w:pStyle w:val="ListBullet"/>
+        <w:bidi w:val="1"/>
+        <w:jc w:val="right"/>
+      </w:pPr>
+      <w:r>
+        <w:rPr>
+          <w:rFonts w:ascii="Tahoma" w:hAnsi="Tahoma" w:cs="Tahoma" w:eastAsia="Tahoma"/>
+          <w:b w:val="0"/>
+          <w:color w:val="B45309"/>
+          <w:sz w:val="24"/>
+          <w:rtl w:val="1"/>
+          <w:cs/>
+        </w:rPr>
+        <w:t>فایل JSON حدود ۱ کیلوبایت داخل پوشه updates</w:t>
+      </w:r>
+    </w:p>
+    <w:p>
+      <w:pPr>
+        <w:pStyle w:val="ListBullet"/>
+        <w:bidi w:val="1"/>
+        <w:jc w:val="right"/>
+      </w:pPr>
+      <w:r>
+        <w:rPr>
+          <w:rFonts w:ascii="Tahoma" w:hAnsi="Tahoma" w:cs="Tahoma" w:eastAsia="Tahoma"/>
+          <w:b w:val="0"/>
+          <w:color w:val="B45309"/>
+          <w:sz w:val="24"/>
+          <w:rtl w:val="1"/>
+          <w:cs/>
+        </w:rPr>
+        <w:t>پیام چت یا متن راهنما</w:t>
+      </w:r>
+    </w:p>
+    <w:p>
+      <w:pPr>
+        <w:pStyle w:val="ListBullet"/>
+        <w:bidi w:val="1"/>
+        <w:jc w:val="right"/>
+      </w:pPr>
+      <w:r>
+        <w:rPr>
+          <w:rFonts w:ascii="Tahoma" w:hAnsi="Tahoma" w:cs="Tahoma" w:eastAsia="Tahoma"/>
+          <w:b w:val="0"/>
+          <w:color w:val="B45309"/>
+          <w:sz w:val="24"/>
+          <w:rtl w:val="1"/>
+          <w:cs/>
+        </w:rPr>
+        <w:t>فایل گزارش .md</w:t>
+      </w:r>
+    </w:p>
+    <w:p>
+      <w:pPr>
+        <w:bidi w:val="1"/>
+        <w:jc w:val="right"/>
+      </w:pPr>
+      <w:r>
+        <w:rPr>
+          <w:rFonts w:ascii="Tahoma" w:hAnsi="Tahoma" w:cs="Tahoma" w:eastAsia="Tahoma"/>
+          <w:b/>
+          <w:color w:val="B45309"/>
+          <w:sz w:val="24"/>
+          <w:rtl w:val="1"/>
+          <w:cs/>
+        </w:rPr>
+        <w:t>اگر فقط یک JSON کوچک کپی کردید، هیچ برنامه‌ای نصب نشده است.</w:t>
+      </w:r>
+    </w:p>
+    <w:p>
+      <w:pPr>
+        <w:bidi w:val="1"/>
+        <w:jc w:val="right"/>
+      </w:pPr>
+      <w:r>
+        <w:rPr>
+          <w:rFonts w:ascii="Tahoma" w:hAnsi="Tahoma" w:cs="Tahoma" w:eastAsia="Tahoma"/>
+          <w:b/>
+          <w:sz w:val="24"/>
+          <w:rtl w:val="1"/>
+          <w:cs/>
+        </w:rPr>
+        <w:t>برنامه واقعی بعد از نصب این دو فایل کنار هم است:</w:t>
+      </w:r>
+    </w:p>
+    <w:p>
+      <w:pPr>
+        <w:pStyle w:val="ListBullet"/>
+        <w:bidi w:val="1"/>
+        <w:jc w:val="right"/>
+      </w:pPr>
+      <w:r>
+        <w:rPr>
+          <w:rFonts w:ascii="Tahoma" w:hAnsi="Tahoma" w:cs="Tahoma" w:eastAsia="Tahoma"/>
+          <w:b w:val="0"/>
+          <w:sz w:val="24"/>
+          <w:rtl w:val="1"/>
+          <w:cs/>
+        </w:rPr>
+        <w:t>Sirman.exe</w:t>
+      </w:r>
+    </w:p>
+    <w:p>
+      <w:pPr>
+        <w:pStyle w:val="ListBullet"/>
+        <w:bidi w:val="1"/>
+        <w:jc w:val="right"/>
+      </w:pPr>
+      <w:r>
+        <w:rPr>
+          <w:rFonts w:ascii="Tahoma" w:hAnsi="Tahoma" w:cs="Tahoma" w:eastAsia="Tahoma"/>
+          <w:b w:val="0"/>
+          <w:sz w:val="24"/>
+          <w:rtl w:val="1"/>
+          <w:cs/>
+        </w:rPr>
+        <w:t>Sirman_Final.html  — حدود ۱٫۶ مگابایت. اگر چند کیلوبایت بود، فایل اشتباه است.</w:t>
       </w:r>
     </w:p>
     <w:p>
@@ -178,27 +278,64 @@
       </w:pPr>
       <w:r>
         <w:rPr>
-          <w:rFonts w:ascii="Tahoma" w:hAnsi="Tahoma"/>
+          <w:rFonts w:ascii="Tahoma" w:hAnsi="Tahoma" w:cs="Tahoma" w:eastAsia="Tahoma"/>
           <w:b/>
           <w:sz w:val="24"/>
           <w:rtl w:val="1"/>
+          <w:cs/>
         </w:rPr>
-        <w:t>۲) فایل یک‌کیلوبایتی برنامه نیست</w:t>
+        <w:t>۲) پیش‌نیاز ویندوز فروشگاه</w:t>
       </w:r>
     </w:p>
     <w:p>
       <w:pPr>
+        <w:pStyle w:val="ListBullet"/>
         <w:bidi w:val="1"/>
         <w:jc w:val="right"/>
       </w:pPr>
       <w:r>
         <w:rPr>
-          <w:rFonts w:ascii="Tahoma" w:hAnsi="Tahoma"/>
+          <w:rFonts w:ascii="Tahoma" w:hAnsi="Tahoma" w:cs="Tahoma" w:eastAsia="Tahoma"/>
           <w:b w:val="0"/>
           <w:sz w:val="24"/>
           <w:rtl w:val="1"/>
+          <w:cs/>
         </w:rPr>
-        <w:t>JSON داخل updates برنامه نیست. برنامه واقعی داخل پوشه App کیت است: Sirman_Final.html حدود ۱٫۶ مگابایت و Sirman.exe.</w:t>
+        <w:t>ویندوز ۱۰ یا ۱۱، ۶۴ بیتی</w:t>
+      </w:r>
+    </w:p>
+    <w:p>
+      <w:pPr>
+        <w:pStyle w:val="ListBullet"/>
+        <w:bidi w:val="1"/>
+        <w:jc w:val="right"/>
+      </w:pPr>
+      <w:r>
+        <w:rPr>
+          <w:rFonts w:ascii="Tahoma" w:hAnsi="Tahoma" w:cs="Tahoma" w:eastAsia="Tahoma"/>
+          <w:b w:val="0"/>
+          <w:sz w:val="24"/>
+          <w:rtl w:val="1"/>
+          <w:cs/>
+        </w:rPr>
+        <w:t>.NET 8 Desktop Runtime x64 از صفحه دانلود دات‌نت ۸ — همان صفحه: Desktop Runtime 8، Windows x64</w:t>
+      </w:r>
+    </w:p>
+    <w:p>
+      <w:pPr>
+        <w:pStyle w:val="ListBullet"/>
+        <w:bidi w:val="1"/>
+        <w:jc w:val="right"/>
+      </w:pPr>
+      <w:r>
+        <w:rPr>
+          <w:rFonts w:ascii="Tahoma" w:hAnsi="Tahoma" w:cs="Tahoma" w:eastAsia="Tahoma"/>
+          <w:b w:val="0"/>
+          <w:sz w:val="24"/>
+          <w:rtl w:val="1"/>
+          <w:cs/>
+        </w:rPr>
+        <w:t>WebView2 — معمولاً با Edge هست. اگر exe صفحه سفید داد، Runtime وب‌ویو را نصب کنید.</w:t>
       </w:r>
     </w:p>
     <w:p>
@@ -209,12 +346,13 @@
       </w:pPr>
       <w:r>
         <w:rPr>
-          <w:rFonts w:ascii="Tahoma" w:hAnsi="Tahoma"/>
+          <w:rFonts w:ascii="Tahoma" w:hAnsi="Tahoma" w:cs="Tahoma" w:eastAsia="Tahoma"/>
           <w:b/>
           <w:sz w:val="24"/>
           <w:rtl w:val="1"/>
+          <w:cs/>
         </w:rPr>
-        <w:t>۳) اگر exe باز نشد</w:t>
+        <w:t>۳) نصب از صفر — روش درست</w:t>
       </w:r>
     </w:p>
     <w:p>
@@ -224,12 +362,244 @@
       </w:pPr>
       <w:r>
         <w:rPr>
-          <w:rFonts w:ascii="Tahoma" w:hAnsi="Tahoma"/>
+          <w:rFonts w:ascii="Tahoma" w:hAnsi="Tahoma" w:cs="Tahoma" w:eastAsia="Tahoma"/>
+          <w:b/>
+          <w:sz w:val="24"/>
+          <w:rtl w:val="1"/>
+          <w:cs/>
+        </w:rPr>
+        <w:t>فایل‌ها را یکی‌یکی کپی نکنید. از نصب.bat استفاده کنید.</w:t>
+      </w:r>
+    </w:p>
+    <w:p>
+      <w:pPr>
+        <w:pStyle w:val="Heading3"/>
+        <w:bidi w:val="1"/>
+        <w:jc w:val="right"/>
+      </w:pPr>
+      <w:r>
+        <w:rPr>
+          <w:rFonts w:ascii="Tahoma" w:hAnsi="Tahoma" w:cs="Tahoma" w:eastAsia="Tahoma"/>
+          <w:b/>
+          <w:sz w:val="24"/>
+          <w:rtl w:val="1"/>
+          <w:cs/>
+        </w:rPr>
+        <w:t>گام ۱</w:t>
+      </w:r>
+    </w:p>
+    <w:p>
+      <w:pPr>
+        <w:bidi w:val="1"/>
+        <w:jc w:val="right"/>
+      </w:pPr>
+      <w:r>
+        <w:rPr>
+          <w:rFonts w:ascii="Tahoma" w:hAnsi="Tahoma" w:cs="Tahoma" w:eastAsia="Tahoma"/>
           <w:b w:val="0"/>
           <w:sz w:val="24"/>
           <w:rtl w:val="1"/>
+          <w:cs/>
         </w:rPr>
-        <w:t>Desktop Runtime 8 ویندوز لازم است. وگرنه از پوشه نصب Sirman_Start.bat را بزنید. WebView2 معمولاً با Edge هست.</w:t>
+        <w:t>فایل Sirman_Setup_1405.6.2α.zip را روی هارد فروشگاه کپی کنید. از روی فلش قفل‌شده اجرا نکنید.</w:t>
+      </w:r>
+    </w:p>
+    <w:p>
+      <w:pPr>
+        <w:pStyle w:val="Heading3"/>
+        <w:bidi w:val="1"/>
+        <w:jc w:val="right"/>
+      </w:pPr>
+      <w:r>
+        <w:rPr>
+          <w:rFonts w:ascii="Tahoma" w:hAnsi="Tahoma" w:cs="Tahoma" w:eastAsia="Tahoma"/>
+          <w:b/>
+          <w:sz w:val="24"/>
+          <w:rtl w:val="1"/>
+          <w:cs/>
+        </w:rPr>
+        <w:t>گام ۲</w:t>
+      </w:r>
+    </w:p>
+    <w:p>
+      <w:pPr>
+        <w:bidi w:val="1"/>
+        <w:jc w:val="right"/>
+      </w:pPr>
+      <w:r>
+        <w:rPr>
+          <w:rFonts w:ascii="Tahoma" w:hAnsi="Tahoma" w:cs="Tahoma" w:eastAsia="Tahoma"/>
+          <w:b w:val="0"/>
+          <w:sz w:val="24"/>
+          <w:rtl w:val="1"/>
+          <w:cs/>
+        </w:rPr>
+        <w:t>روی zip راست‌کلیک کنید و Extract All / استخراج همه را بزنید.</w:t>
+      </w:r>
+    </w:p>
+    <w:p>
+      <w:pPr>
+        <w:pStyle w:val="Heading3"/>
+        <w:bidi w:val="1"/>
+        <w:jc w:val="right"/>
+      </w:pPr>
+      <w:r>
+        <w:rPr>
+          <w:rFonts w:ascii="Tahoma" w:hAnsi="Tahoma" w:cs="Tahoma" w:eastAsia="Tahoma"/>
+          <w:b/>
+          <w:sz w:val="24"/>
+          <w:rtl w:val="1"/>
+          <w:cs/>
+        </w:rPr>
+        <w:t>گام ۳</w:t>
+      </w:r>
+    </w:p>
+    <w:p>
+      <w:pPr>
+        <w:bidi w:val="1"/>
+        <w:jc w:val="right"/>
+      </w:pPr>
+      <w:r>
+        <w:rPr>
+          <w:rFonts w:ascii="Tahoma" w:hAnsi="Tahoma" w:cs="Tahoma" w:eastAsia="Tahoma"/>
+          <w:b w:val="0"/>
+          <w:sz w:val="24"/>
+          <w:rtl w:val="1"/>
+          <w:cs/>
+        </w:rPr>
+        <w:t>داخل پوشه باید نصب.bat و پوشه App (با Sirman.exe و Sirman_Final.html) را ببینید.</w:t>
+      </w:r>
+    </w:p>
+    <w:p>
+      <w:pPr>
+        <w:pStyle w:val="Heading3"/>
+        <w:bidi w:val="1"/>
+        <w:jc w:val="right"/>
+      </w:pPr>
+      <w:r>
+        <w:rPr>
+          <w:rFonts w:ascii="Tahoma" w:hAnsi="Tahoma" w:cs="Tahoma" w:eastAsia="Tahoma"/>
+          <w:b/>
+          <w:sz w:val="24"/>
+          <w:rtl w:val="1"/>
+          <w:cs/>
+        </w:rPr>
+        <w:t>گام ۴</w:t>
+      </w:r>
+    </w:p>
+    <w:p>
+      <w:pPr>
+        <w:bidi w:val="1"/>
+        <w:jc w:val="right"/>
+      </w:pPr>
+      <w:r>
+        <w:rPr>
+          <w:rFonts w:ascii="Tahoma" w:hAnsi="Tahoma" w:cs="Tahoma" w:eastAsia="Tahoma"/>
+          <w:b w:val="0"/>
+          <w:sz w:val="24"/>
+          <w:rtl w:val="1"/>
+          <w:cs/>
+        </w:rPr>
+        <w:t>فقط روی «نصب.bat» دوبار کلیک کنید. اگر ویندوز هشدار داد، Run anyway بزنید.</w:t>
+      </w:r>
+    </w:p>
+    <w:p>
+      <w:pPr>
+        <w:pStyle w:val="Heading3"/>
+        <w:bidi w:val="1"/>
+        <w:jc w:val="right"/>
+      </w:pPr>
+      <w:r>
+        <w:rPr>
+          <w:rFonts w:ascii="Tahoma" w:hAnsi="Tahoma" w:cs="Tahoma" w:eastAsia="Tahoma"/>
+          <w:b/>
+          <w:sz w:val="24"/>
+          <w:rtl w:val="1"/>
+          <w:cs/>
+        </w:rPr>
+        <w:t>گام ۵</w:t>
+      </w:r>
+    </w:p>
+    <w:p>
+      <w:pPr>
+        <w:bidi w:val="1"/>
+        <w:jc w:val="right"/>
+      </w:pPr>
+      <w:r>
+        <w:rPr>
+          <w:rFonts w:ascii="Tahoma" w:hAnsi="Tahoma" w:cs="Tahoma" w:eastAsia="Tahoma"/>
+          <w:b w:val="0"/>
+          <w:sz w:val="24"/>
+          <w:rtl w:val="1"/>
+          <w:cs/>
+        </w:rPr>
+        <w:t>پوشه نصب را انتخاب کنید. پیشنهاد: Documents\Sirman. میانبر دسکتاپ را تأیید کنید.</w:t>
+      </w:r>
+    </w:p>
+    <w:p>
+      <w:pPr>
+        <w:pStyle w:val="Heading3"/>
+        <w:bidi w:val="1"/>
+        <w:jc w:val="right"/>
+      </w:pPr>
+      <w:r>
+        <w:rPr>
+          <w:rFonts w:ascii="Tahoma" w:hAnsi="Tahoma" w:cs="Tahoma" w:eastAsia="Tahoma"/>
+          <w:b/>
+          <w:sz w:val="24"/>
+          <w:rtl w:val="1"/>
+          <w:cs/>
+        </w:rPr>
+        <w:t>گام ۶</w:t>
+      </w:r>
+    </w:p>
+    <w:p>
+      <w:pPr>
+        <w:bidi w:val="1"/>
+        <w:jc w:val="right"/>
+      </w:pPr>
+      <w:r>
+        <w:rPr>
+          <w:rFonts w:ascii="Tahoma" w:hAnsi="Tahoma" w:cs="Tahoma" w:eastAsia="Tahoma"/>
+          <w:b w:val="0"/>
+          <w:sz w:val="24"/>
+          <w:rtl w:val="1"/>
+          <w:cs/>
+        </w:rPr>
+        <w:t>از آیکون دسکتاپ یا منوی Start برنامه «سیرمان» را باز کنید.</w:t>
+      </w:r>
+    </w:p>
+    <w:p>
+      <w:pPr>
+        <w:pStyle w:val="Heading3"/>
+        <w:bidi w:val="1"/>
+        <w:jc w:val="right"/>
+      </w:pPr>
+      <w:r>
+        <w:rPr>
+          <w:rFonts w:ascii="Tahoma" w:hAnsi="Tahoma" w:cs="Tahoma" w:eastAsia="Tahoma"/>
+          <w:b/>
+          <w:sz w:val="24"/>
+          <w:rtl w:val="1"/>
+          <w:cs/>
+        </w:rPr>
+        <w:t>گام ۷</w:t>
+      </w:r>
+    </w:p>
+    <w:p>
+      <w:pPr>
+        <w:bidi w:val="1"/>
+        <w:jc w:val="right"/>
+      </w:pPr>
+      <w:r>
+        <w:rPr>
+          <w:rFonts w:ascii="Tahoma" w:hAnsi="Tahoma" w:cs="Tahoma" w:eastAsia="Tahoma"/>
+          <w:b w:val="0"/>
+          <w:sz w:val="24"/>
+          <w:rtl w:val="1"/>
+          <w:cs/>
+        </w:rPr>
+        <w:t>پایین سایدبار سمت راست نسخه باید ۱۴۰۵.۶.۲α باشد. تمام.</w:t>
       </w:r>
     </w:p>
     <w:p>
@@ -240,12 +610,81 @@
       </w:pPr>
       <w:r>
         <w:rPr>
-          <w:rFonts w:ascii="Tahoma" w:hAnsi="Tahoma"/>
+          <w:rFonts w:ascii="Tahoma" w:hAnsi="Tahoma" w:cs="Tahoma" w:eastAsia="Tahoma"/>
           <w:b/>
           <w:sz w:val="24"/>
           <w:rtl w:val="1"/>
+          <w:cs/>
         </w:rPr>
-        <w:t>۴) داده</w:t>
+        <w:t>۴) اگر Sirman.exe باز نشد</w:t>
+      </w:r>
+    </w:p>
+    <w:p>
+      <w:pPr>
+        <w:pStyle w:val="ListBullet"/>
+        <w:bidi w:val="1"/>
+        <w:jc w:val="right"/>
+      </w:pPr>
+      <w:r>
+        <w:rPr>
+          <w:rFonts w:ascii="Tahoma" w:hAnsi="Tahoma" w:cs="Tahoma" w:eastAsia="Tahoma"/>
+          <w:b w:val="0"/>
+          <w:sz w:val="24"/>
+          <w:rtl w:val="1"/>
+          <w:cs/>
+        </w:rPr>
+        <w:t>پیام نبودن .NET: Desktop Runtime 8 ویندوز x64 را نصب کنید، Restart، دوباره باز کنید.</w:t>
+      </w:r>
+    </w:p>
+    <w:p>
+      <w:pPr>
+        <w:pStyle w:val="ListBullet"/>
+        <w:bidi w:val="1"/>
+        <w:jc w:val="right"/>
+      </w:pPr>
+      <w:r>
+        <w:rPr>
+          <w:rFonts w:ascii="Tahoma" w:hAnsi="Tahoma" w:cs="Tahoma" w:eastAsia="Tahoma"/>
+          <w:b w:val="0"/>
+          <w:sz w:val="24"/>
+          <w:rtl w:val="1"/>
+          <w:cs/>
+        </w:rPr>
+        <w:t>صفحه سفید: WebView2 را نصب کنید. HTML باید کنار exe باشد.</w:t>
+      </w:r>
+    </w:p>
+    <w:p>
+      <w:pPr>
+        <w:pStyle w:val="ListBullet"/>
+        <w:bidi w:val="1"/>
+        <w:jc w:val="right"/>
+      </w:pPr>
+      <w:r>
+        <w:rPr>
+          <w:rFonts w:ascii="Tahoma" w:hAnsi="Tahoma" w:cs="Tahoma" w:eastAsia="Tahoma"/>
+          <w:b w:val="0"/>
+          <w:sz w:val="24"/>
+          <w:rtl w:val="1"/>
+          <w:cs/>
+        </w:rPr>
+        <w:t>بدون exe: داخل پوشه نصب Sirman_Start.bat را بزنید و پنجره مشکی را نبندید.</w:t>
+      </w:r>
+    </w:p>
+    <w:p>
+      <w:pPr>
+        <w:pStyle w:val="Heading2"/>
+        <w:bidi w:val="1"/>
+        <w:jc w:val="right"/>
+      </w:pPr>
+      <w:r>
+        <w:rPr>
+          <w:rFonts w:ascii="Tahoma" w:hAnsi="Tahoma" w:cs="Tahoma" w:eastAsia="Tahoma"/>
+          <w:b/>
+          <w:sz w:val="24"/>
+          <w:rtl w:val="1"/>
+          <w:cs/>
+        </w:rPr>
+        <w:t>۵) داده کجاست؟</w:t>
       </w:r>
     </w:p>
     <w:p>
@@ -255,17 +694,323 @@
       </w:pPr>
       <w:r>
         <w:rPr>
-          <w:rFonts w:ascii="Tahoma" w:hAnsi="Tahoma"/>
+          <w:rFonts w:ascii="Tahoma" w:hAnsi="Tahoma" w:cs="Tahoma" w:eastAsia="Tahoma"/>
+          <w:b/>
+          <w:color w:val="B45309"/>
+          <w:sz w:val="24"/>
+          <w:rtl w:val="1"/>
+          <w:cs/>
+        </w:rPr>
+        <w:t>فاکتور، گارانتی، انبار و مخاطب داخل zip یا HTML نیست. روی همان کامپیوتر ذخیره می‌شود.</w:t>
+      </w:r>
+    </w:p>
+    <w:p>
+      <w:pPr>
+        <w:pStyle w:val="ListBullet"/>
+        <w:bidi w:val="1"/>
+        <w:jc w:val="right"/>
+      </w:pPr>
+      <w:r>
+        <w:rPr>
+          <w:rFonts w:ascii="Tahoma" w:hAnsi="Tahoma" w:cs="Tahoma" w:eastAsia="Tahoma"/>
           <w:b w:val="0"/>
           <w:sz w:val="24"/>
           <w:rtl w:val="1"/>
+          <w:cs/>
         </w:rPr>
-        <w:t>فاکتور داخل فایل برنامه نیست. برای کامپیوتر جدید بک‌آپ «ورود/خروج داده» را برگردانید.</w:t>
+        <w:t>اگر فقط فایل برنامه را به سیستم دیگر ببرید، آنجا خالی باز می‌شود.</w:t>
+      </w:r>
+    </w:p>
+    <w:p>
+      <w:pPr>
+        <w:pStyle w:val="ListBullet"/>
+        <w:bidi w:val="1"/>
+        <w:jc w:val="right"/>
+      </w:pPr>
+      <w:r>
+        <w:rPr>
+          <w:rFonts w:ascii="Tahoma" w:hAnsi="Tahoma" w:cs="Tahoma" w:eastAsia="Tahoma"/>
+          <w:b w:val="0"/>
+          <w:sz w:val="24"/>
+          <w:rtl w:val="1"/>
+          <w:cs/>
+        </w:rPr>
+        <w:t>قبل از تعویض سیستم از داخل برنامه «ورود/خروج داده» بک‌آپ بگیرید.</w:t>
+      </w:r>
+    </w:p>
+    <w:p>
+      <w:pPr>
+        <w:pStyle w:val="ListBullet"/>
+        <w:bidi w:val="1"/>
+        <w:jc w:val="right"/>
+      </w:pPr>
+      <w:r>
+        <w:rPr>
+          <w:rFonts w:ascii="Tahoma" w:hAnsi="Tahoma" w:cs="Tahoma" w:eastAsia="Tahoma"/>
+          <w:b w:val="0"/>
+          <w:sz w:val="24"/>
+          <w:rtl w:val="1"/>
+          <w:cs/>
+        </w:rPr>
+        <w:t>روی سیستم جدید همان بک‌آپ را با حالت جایگزینی برگردانید.</w:t>
+      </w:r>
+    </w:p>
+    <w:p>
+      <w:pPr>
+        <w:pStyle w:val="Heading2"/>
+        <w:bidi w:val="1"/>
+        <w:jc w:val="right"/>
+      </w:pPr>
+      <w:r>
+        <w:rPr>
+          <w:rFonts w:ascii="Tahoma" w:hAnsi="Tahoma" w:cs="Tahoma" w:eastAsia="Tahoma"/>
+          <w:b/>
+          <w:sz w:val="24"/>
+          <w:rtl w:val="1"/>
+          <w:cs/>
+        </w:rPr>
+        <w:t>۶) اگر از قبل برنامه را دارید</w:t>
+      </w:r>
+    </w:p>
+    <w:p>
+      <w:pPr>
+        <w:pStyle w:val="ListBullet"/>
+        <w:bidi w:val="1"/>
+        <w:jc w:val="right"/>
+      </w:pPr>
+      <w:r>
+        <w:rPr>
+          <w:rFonts w:ascii="Tahoma" w:hAnsi="Tahoma" w:cs="Tahoma" w:eastAsia="Tahoma"/>
+          <w:b w:val="0"/>
+          <w:sz w:val="24"/>
+          <w:rtl w:val="1"/>
+          <w:cs/>
+        </w:rPr>
+        <w:t>اول از «ورود/خروج داده» بک‌آپ کامل بگیرید.</w:t>
+      </w:r>
+    </w:p>
+    <w:p>
+      <w:pPr>
+        <w:pStyle w:val="ListBullet"/>
+        <w:bidi w:val="1"/>
+        <w:jc w:val="right"/>
+      </w:pPr>
+      <w:r>
+        <w:rPr>
+          <w:rFonts w:ascii="Tahoma" w:hAnsi="Tahoma" w:cs="Tahoma" w:eastAsia="Tahoma"/>
+          <w:b w:val="0"/>
+          <w:sz w:val="24"/>
+          <w:rtl w:val="1"/>
+          <w:cs/>
+        </w:rPr>
+        <w:t>همین zip را Extract کنید و دوباره نصب.bat را روی همان پوشه نصب قبلی بزنید.</w:t>
+      </w:r>
+    </w:p>
+    <w:p>
+      <w:pPr>
+        <w:pStyle w:val="ListBullet"/>
+        <w:bidi w:val="1"/>
+        <w:jc w:val="right"/>
+      </w:pPr>
+      <w:r>
+        <w:rPr>
+          <w:rFonts w:ascii="Tahoma" w:hAnsi="Tahoma" w:cs="Tahoma" w:eastAsia="Tahoma"/>
+          <w:b w:val="0"/>
+          <w:sz w:val="24"/>
+          <w:rtl w:val="1"/>
+          <w:cs/>
+        </w:rPr>
+        <w:t>کیت، فایل Pending قدیمی ۱ کیلوبایتی را با آپدیت کامل همین نسخه عوض می‌کند.</w:t>
+      </w:r>
+    </w:p>
+    <w:p>
+      <w:pPr>
+        <w:pStyle w:val="ListBullet"/>
+        <w:bidi w:val="1"/>
+        <w:jc w:val="right"/>
+      </w:pPr>
+      <w:r>
+        <w:rPr>
+          <w:rFonts w:ascii="Tahoma" w:hAnsi="Tahoma" w:cs="Tahoma" w:eastAsia="Tahoma"/>
+          <w:b w:val="0"/>
+          <w:sz w:val="24"/>
+          <w:rtl w:val="1"/>
+          <w:cs/>
+        </w:rPr>
+        <w:t>بعد از باز کردن، نسخه باید ۱۴۰۵.۶.۲α باشد و فاکتور قبلی سر جایش.</w:t>
+      </w:r>
+    </w:p>
+    <w:p>
+      <w:pPr>
+        <w:bidi w:val="1"/>
+        <w:jc w:val="right"/>
+      </w:pPr>
+      <w:r>
+        <w:rPr>
+          <w:rFonts w:ascii="Tahoma" w:hAnsi="Tahoma" w:cs="Tahoma" w:eastAsia="Tahoma"/>
+          <w:b/>
+          <w:color w:val="B45309"/>
+          <w:sz w:val="24"/>
+          <w:rtl w:val="1"/>
+          <w:cs/>
+        </w:rPr>
+        <w:t>فایل JSON یک‌کیلوبایتی را به‌جای برنامه بارگذاری نکنید.</w:t>
+      </w:r>
+    </w:p>
+    <w:p>
+      <w:pPr>
+        <w:pStyle w:val="Heading2"/>
+        <w:bidi w:val="1"/>
+        <w:jc w:val="right"/>
+      </w:pPr>
+      <w:r>
+        <w:rPr>
+          <w:rFonts w:ascii="Tahoma" w:hAnsi="Tahoma" w:cs="Tahoma" w:eastAsia="Tahoma"/>
+          <w:b/>
+          <w:sz w:val="24"/>
+          <w:rtl w:val="1"/>
+          <w:cs/>
+        </w:rPr>
+        <w:t>۷) چک درست نصب شدن</w:t>
+      </w:r>
+    </w:p>
+    <w:p>
+      <w:pPr>
+        <w:pStyle w:val="ListBullet"/>
+        <w:bidi w:val="1"/>
+        <w:jc w:val="right"/>
+      </w:pPr>
+      <w:r>
+        <w:rPr>
+          <w:rFonts w:ascii="Tahoma" w:hAnsi="Tahoma" w:cs="Tahoma" w:eastAsia="Tahoma"/>
+          <w:b w:val="0"/>
+          <w:sz w:val="24"/>
+          <w:rtl w:val="1"/>
+          <w:cs/>
+        </w:rPr>
+        <w:t>zip استخراج شده و نصب.bat اجرا شده است.</w:t>
+      </w:r>
+    </w:p>
+    <w:p>
+      <w:pPr>
+        <w:pStyle w:val="ListBullet"/>
+        <w:bidi w:val="1"/>
+        <w:jc w:val="right"/>
+      </w:pPr>
+      <w:r>
+        <w:rPr>
+          <w:rFonts w:ascii="Tahoma" w:hAnsi="Tahoma" w:cs="Tahoma" w:eastAsia="Tahoma"/>
+          <w:b w:val="0"/>
+          <w:sz w:val="24"/>
+          <w:rtl w:val="1"/>
+          <w:cs/>
+        </w:rPr>
+        <w:t>Sirman.exe و Sirman_Final.html حدود ۱٫۶ مگابایت کنار هم هستند.</w:t>
+      </w:r>
+    </w:p>
+    <w:p>
+      <w:pPr>
+        <w:pStyle w:val="ListBullet"/>
+        <w:bidi w:val="1"/>
+        <w:jc w:val="right"/>
+      </w:pPr>
+      <w:r>
+        <w:rPr>
+          <w:rFonts w:ascii="Tahoma" w:hAnsi="Tahoma" w:cs="Tahoma" w:eastAsia="Tahoma"/>
+          <w:b w:val="0"/>
+          <w:sz w:val="24"/>
+          <w:rtl w:val="1"/>
+          <w:cs/>
+        </w:rPr>
+        <w:t>برنامه باز می‌شود.</w:t>
+      </w:r>
+    </w:p>
+    <w:p>
+      <w:pPr>
+        <w:pStyle w:val="ListBullet"/>
+        <w:bidi w:val="1"/>
+        <w:jc w:val="right"/>
+      </w:pPr>
+      <w:r>
+        <w:rPr>
+          <w:rFonts w:ascii="Tahoma" w:hAnsi="Tahoma" w:cs="Tahoma" w:eastAsia="Tahoma"/>
+          <w:b w:val="0"/>
+          <w:sz w:val="24"/>
+          <w:rtl w:val="1"/>
+          <w:cs/>
+        </w:rPr>
+        <w:t>پایین سایدبار نسخه ۱۴۰۵.۶.۲α است.</w:t>
+      </w:r>
+    </w:p>
+    <w:p>
+      <w:pPr>
+        <w:pStyle w:val="ListBullet"/>
+        <w:bidi w:val="1"/>
+        <w:jc w:val="right"/>
+      </w:pPr>
+      <w:r>
+        <w:rPr>
+          <w:rFonts w:ascii="Tahoma" w:hAnsi="Tahoma" w:cs="Tahoma" w:eastAsia="Tahoma"/>
+          <w:b w:val="0"/>
+          <w:sz w:val="24"/>
+          <w:rtl w:val="1"/>
+          <w:cs/>
+        </w:rPr>
+        <w:t>اگر داده قبلی داشتید، فاکتور و گارانتی هنوز هستند.</w:t>
+      </w:r>
+    </w:p>
+    <w:p>
+      <w:pPr>
+        <w:pStyle w:val="Heading2"/>
+        <w:bidi w:val="1"/>
+        <w:jc w:val="right"/>
+      </w:pPr>
+      <w:r>
+        <w:rPr>
+          <w:rFonts w:ascii="Tahoma" w:hAnsi="Tahoma" w:cs="Tahoma" w:eastAsia="Tahoma"/>
+          <w:b/>
+          <w:sz w:val="24"/>
+          <w:rtl w:val="1"/>
+          <w:cs/>
+        </w:rPr>
+        <w:t>۸) حذف</w:t>
+      </w:r>
+    </w:p>
+    <w:p>
+      <w:pPr>
+        <w:bidi w:val="1"/>
+        <w:jc w:val="right"/>
+      </w:pPr>
+      <w:r>
+        <w:rPr>
+          <w:rFonts w:ascii="Tahoma" w:hAnsi="Tahoma" w:cs="Tahoma" w:eastAsia="Tahoma"/>
+          <w:b w:val="0"/>
+          <w:sz w:val="24"/>
+          <w:rtl w:val="1"/>
+          <w:cs/>
+        </w:rPr>
+        <w:t>منوی Start → حذف سیرمان، یا Uninstall-Sirman.bat داخل پوشه نصب.</w:t>
+      </w:r>
+    </w:p>
+    <w:p>
+      <w:pPr>
+        <w:bidi w:val="1"/>
+        <w:jc w:val="right"/>
+      </w:pPr>
+      <w:r>
+        <w:rPr>
+          <w:rFonts w:ascii="Tahoma" w:hAnsi="Tahoma" w:cs="Tahoma" w:eastAsia="Tahoma"/>
+          <w:b w:val="0"/>
+          <w:sz w:val="24"/>
+          <w:rtl w:val="1"/>
+          <w:cs/>
+        </w:rPr>
+        <w:t>قبل از حذف از «ورود/خروج داده» بک‌آپ بگیرید.</w:t>
       </w:r>
     </w:p>
     <w:sectPr>
       <w:pgSz w:w="12240" w:h="15840"/>
-      <w:pgMar w:top="1440" w:right="1134" w:bottom="1440" w:left="1134" w:header="720" w:footer="720" w:gutter="0"/>
+      <w:pgMar w:top="907" w:right="1134" w:bottom="907" w:left="1134" w:header="720" w:footer="720" w:gutter="0"/>
       <w:cols w:space="720"/>
       <w:docGrid w:linePitch="360"/>
       <w:bidi w:val="1"/>

</xml_diff>